<commit_message>
Modificación del día 13/11/25
</commit_message>
<xml_diff>
--- a/DWES+AD+DAW/DAW-Azure/A05 - Actividad Apache + Despliegue app PHP.docx
+++ b/DWES+AD+DAW/DAW-Azure/A05 - Actividad Apache + Despliegue app PHP.docx
@@ -267,8 +267,8 @@
               <w:rFonts w:asciiTheme="minorHAnsi" w:eastAsiaTheme="minorHAnsi" w:hAnsiTheme="minorHAnsi" w:cstheme="minorBidi"/>
               <w:color w:val="auto"/>
               <w:kern w:val="2"/>
-              <w:sz w:val="24"/>
-              <w:szCs w:val="24"/>
+              <w:sz w:val="20"/>
+              <w:szCs w:val="20"/>
               <w:lang w:eastAsia="en-US"/>
               <w14:ligatures w14:val="standardContextual"/>
             </w:rPr>
@@ -282,6 +282,8 @@
             <w:rPr>
               <w:b/>
               <w:bCs/>
+              <w:sz w:val="24"/>
+              <w:szCs w:val="24"/>
             </w:rPr>
           </w:sdtEndPr>
           <w:sdtContent>
@@ -290,14 +292,14 @@
                 <w:pStyle w:val="TtuloTDC"/>
                 <w:jc w:val="center"/>
                 <w:rPr>
-                  <w:sz w:val="52"/>
-                  <w:szCs w:val="52"/>
+                  <w:sz w:val="48"/>
+                  <w:szCs w:val="48"/>
                 </w:rPr>
               </w:pPr>
               <w:r>
                 <w:rPr>
-                  <w:sz w:val="52"/>
-                  <w:szCs w:val="52"/>
+                  <w:sz w:val="48"/>
+                  <w:szCs w:val="48"/>
                 </w:rPr>
                 <w:t>Índice</w:t>
               </w:r>
@@ -323,7 +325,7 @@
               <w:r>
                 <w:fldChar w:fldCharType="separate"/>
               </w:r>
-              <w:hyperlink w:anchor="_Toc213770163" w:history="1">
+              <w:hyperlink w:anchor="_Toc213951409" w:history="1">
                 <w:r>
                   <w:rPr>
                     <w:rStyle w:val="Hipervnculo"/>
@@ -350,7 +352,7 @@
                     <w:noProof/>
                     <w:webHidden/>
                   </w:rPr>
-                  <w:instrText xml:space="preserve"> PAGEREF _Toc213770163 \h </w:instrText>
+                  <w:instrText xml:space="preserve"> PAGEREF _Toc213951409 \h </w:instrText>
                 </w:r>
                 <w:r>
                   <w:rPr>
@@ -370,7 +372,7 @@
                     <w:noProof/>
                     <w:webHidden/>
                   </w:rPr>
-                  <w:t>2</w:t>
+                  <w:t>3</w:t>
                 </w:r>
                 <w:r>
                   <w:rPr>
@@ -393,7 +395,7 @@
                   <w:lang w:eastAsia="es-ES"/>
                 </w:rPr>
               </w:pPr>
-              <w:hyperlink w:anchor="_Toc213770164" w:history="1">
+              <w:hyperlink w:anchor="_Toc213951410" w:history="1">
                 <w:r>
                   <w:rPr>
                     <w:rStyle w:val="Hipervnculo"/>
@@ -420,7 +422,7 @@
                     <w:noProof/>
                     <w:webHidden/>
                   </w:rPr>
-                  <w:instrText xml:space="preserve"> PAGEREF _Toc213770164 \h </w:instrText>
+                  <w:instrText xml:space="preserve"> PAGEREF _Toc213951410 \h </w:instrText>
                 </w:r>
                 <w:r>
                   <w:rPr>
@@ -440,7 +442,7 @@
                     <w:noProof/>
                     <w:webHidden/>
                   </w:rPr>
-                  <w:t>2</w:t>
+                  <w:t>3</w:t>
                 </w:r>
                 <w:r>
                   <w:rPr>
@@ -463,7 +465,7 @@
                   <w:lang w:eastAsia="es-ES"/>
                 </w:rPr>
               </w:pPr>
-              <w:hyperlink w:anchor="_Toc213770165" w:history="1">
+              <w:hyperlink w:anchor="_Toc213951411" w:history="1">
                 <w:r>
                   <w:rPr>
                     <w:rStyle w:val="Hipervnculo"/>
@@ -490,7 +492,7 @@
                     <w:noProof/>
                     <w:webHidden/>
                   </w:rPr>
-                  <w:instrText xml:space="preserve"> PAGEREF _Toc213770165 \h </w:instrText>
+                  <w:instrText xml:space="preserve"> PAGEREF _Toc213951411 \h </w:instrText>
                 </w:r>
                 <w:r>
                   <w:rPr>
@@ -510,7 +512,7 @@
                     <w:noProof/>
                     <w:webHidden/>
                   </w:rPr>
-                  <w:t>2</w:t>
+                  <w:t>3</w:t>
                 </w:r>
                 <w:r>
                   <w:rPr>
@@ -533,7 +535,7 @@
                   <w:lang w:eastAsia="es-ES"/>
                 </w:rPr>
               </w:pPr>
-              <w:hyperlink w:anchor="_Toc213770166" w:history="1">
+              <w:hyperlink w:anchor="_Toc213951412" w:history="1">
                 <w:r>
                   <w:rPr>
                     <w:rStyle w:val="Hipervnculo"/>
@@ -560,7 +562,7 @@
                     <w:noProof/>
                     <w:webHidden/>
                   </w:rPr>
-                  <w:instrText xml:space="preserve"> PAGEREF _Toc213770166 \h </w:instrText>
+                  <w:instrText xml:space="preserve"> PAGEREF _Toc213951412 \h </w:instrText>
                 </w:r>
                 <w:r>
                   <w:rPr>
@@ -580,7 +582,7 @@
                     <w:noProof/>
                     <w:webHidden/>
                   </w:rPr>
-                  <w:t>3</w:t>
+                  <w:t>4</w:t>
                 </w:r>
                 <w:r>
                   <w:rPr>
@@ -603,7 +605,7 @@
                   <w:lang w:eastAsia="es-ES"/>
                 </w:rPr>
               </w:pPr>
-              <w:hyperlink w:anchor="_Toc213770167" w:history="1">
+              <w:hyperlink w:anchor="_Toc213951413" w:history="1">
                 <w:r>
                   <w:rPr>
                     <w:rStyle w:val="Hipervnculo"/>
@@ -630,7 +632,7 @@
                     <w:noProof/>
                     <w:webHidden/>
                   </w:rPr>
-                  <w:instrText xml:space="preserve"> PAGEREF _Toc213770167 \h </w:instrText>
+                  <w:instrText xml:space="preserve"> PAGEREF _Toc213951413 \h </w:instrText>
                 </w:r>
                 <w:r>
                   <w:rPr>
@@ -650,7 +652,7 @@
                     <w:noProof/>
                     <w:webHidden/>
                   </w:rPr>
-                  <w:t>3</w:t>
+                  <w:t>4</w:t>
                 </w:r>
                 <w:r>
                   <w:rPr>
@@ -673,7 +675,7 @@
                   <w:lang w:eastAsia="es-ES"/>
                 </w:rPr>
               </w:pPr>
-              <w:hyperlink w:anchor="_Toc213770168" w:history="1">
+              <w:hyperlink w:anchor="_Toc213951414" w:history="1">
                 <w:r>
                   <w:rPr>
                     <w:rStyle w:val="Hipervnculo"/>
@@ -700,7 +702,7 @@
                     <w:noProof/>
                     <w:webHidden/>
                   </w:rPr>
-                  <w:instrText xml:space="preserve"> PAGEREF _Toc213770168 \h </w:instrText>
+                  <w:instrText xml:space="preserve"> PAGEREF _Toc213951414 \h </w:instrText>
                 </w:r>
                 <w:r>
                   <w:rPr>
@@ -720,7 +722,7 @@
                     <w:noProof/>
                     <w:webHidden/>
                   </w:rPr>
-                  <w:t>3</w:t>
+                  <w:t>4</w:t>
                 </w:r>
                 <w:r>
                   <w:rPr>
@@ -743,7 +745,7 @@
                   <w:lang w:eastAsia="es-ES"/>
                 </w:rPr>
               </w:pPr>
-              <w:hyperlink w:anchor="_Toc213770169" w:history="1">
+              <w:hyperlink w:anchor="_Toc213951415" w:history="1">
                 <w:r>
                   <w:rPr>
                     <w:rStyle w:val="Hipervnculo"/>
@@ -770,7 +772,7 @@
                     <w:noProof/>
                     <w:webHidden/>
                   </w:rPr>
-                  <w:instrText xml:space="preserve"> PAGEREF _Toc213770169 \h </w:instrText>
+                  <w:instrText xml:space="preserve"> PAGEREF _Toc213951415 \h </w:instrText>
                 </w:r>
                 <w:r>
                   <w:rPr>
@@ -790,7 +792,7 @@
                     <w:noProof/>
                     <w:webHidden/>
                   </w:rPr>
-                  <w:t>3</w:t>
+                  <w:t>4</w:t>
                 </w:r>
                 <w:r>
                   <w:rPr>
@@ -813,7 +815,7 @@
                   <w:lang w:eastAsia="es-ES"/>
                 </w:rPr>
               </w:pPr>
-              <w:hyperlink w:anchor="_Toc213770170" w:history="1">
+              <w:hyperlink w:anchor="_Toc213951416" w:history="1">
                 <w:r>
                   <w:rPr>
                     <w:rStyle w:val="Hipervnculo"/>
@@ -840,7 +842,7 @@
                     <w:noProof/>
                     <w:webHidden/>
                   </w:rPr>
-                  <w:instrText xml:space="preserve"> PAGEREF _Toc213770170 \h </w:instrText>
+                  <w:instrText xml:space="preserve"> PAGEREF _Toc213951416 \h </w:instrText>
                 </w:r>
                 <w:r>
                   <w:rPr>
@@ -860,7 +862,7 @@
                     <w:noProof/>
                     <w:webHidden/>
                   </w:rPr>
-                  <w:t>4</w:t>
+                  <w:t>5</w:t>
                 </w:r>
                 <w:r>
                   <w:rPr>
@@ -883,7 +885,7 @@
                   <w:lang w:eastAsia="es-ES"/>
                 </w:rPr>
               </w:pPr>
-              <w:hyperlink w:anchor="_Toc213770171" w:history="1">
+              <w:hyperlink w:anchor="_Toc213951417" w:history="1">
                 <w:r>
                   <w:rPr>
                     <w:rStyle w:val="Hipervnculo"/>
@@ -910,7 +912,7 @@
                     <w:noProof/>
                     <w:webHidden/>
                   </w:rPr>
-                  <w:instrText xml:space="preserve"> PAGEREF _Toc213770171 \h </w:instrText>
+                  <w:instrText xml:space="preserve"> PAGEREF _Toc213951417 \h </w:instrText>
                 </w:r>
                 <w:r>
                   <w:rPr>
@@ -930,7 +932,7 @@
                     <w:noProof/>
                     <w:webHidden/>
                   </w:rPr>
-                  <w:t>4</w:t>
+                  <w:t>5</w:t>
                 </w:r>
                 <w:r>
                   <w:rPr>
@@ -953,7 +955,7 @@
                   <w:lang w:eastAsia="es-ES"/>
                 </w:rPr>
               </w:pPr>
-              <w:hyperlink w:anchor="_Toc213770172" w:history="1">
+              <w:hyperlink w:anchor="_Toc213951418" w:history="1">
                 <w:r>
                   <w:rPr>
                     <w:rStyle w:val="Hipervnculo"/>
@@ -980,7 +982,7 @@
                     <w:noProof/>
                     <w:webHidden/>
                   </w:rPr>
-                  <w:instrText xml:space="preserve"> PAGEREF _Toc213770172 \h </w:instrText>
+                  <w:instrText xml:space="preserve"> PAGEREF _Toc213951418 \h </w:instrText>
                 </w:r>
                 <w:r>
                   <w:rPr>
@@ -1000,7 +1002,7 @@
                     <w:noProof/>
                     <w:webHidden/>
                   </w:rPr>
-                  <w:t>4</w:t>
+                  <w:t>5</w:t>
                 </w:r>
                 <w:r>
                   <w:rPr>
@@ -1023,7 +1025,7 @@
                   <w:lang w:eastAsia="es-ES"/>
                 </w:rPr>
               </w:pPr>
-              <w:hyperlink w:anchor="_Toc213770173" w:history="1">
+              <w:hyperlink w:anchor="_Toc213951419" w:history="1">
                 <w:r>
                   <w:rPr>
                     <w:rStyle w:val="Hipervnculo"/>
@@ -1050,7 +1052,7 @@
                     <w:noProof/>
                     <w:webHidden/>
                   </w:rPr>
-                  <w:instrText xml:space="preserve"> PAGEREF _Toc213770173 \h </w:instrText>
+                  <w:instrText xml:space="preserve"> PAGEREF _Toc213951419 \h </w:instrText>
                 </w:r>
                 <w:r>
                   <w:rPr>
@@ -1070,7 +1072,7 @@
                     <w:noProof/>
                     <w:webHidden/>
                   </w:rPr>
-                  <w:t>5</w:t>
+                  <w:t>6</w:t>
                 </w:r>
                 <w:r>
                   <w:rPr>
@@ -1093,7 +1095,7 @@
                   <w:lang w:eastAsia="es-ES"/>
                 </w:rPr>
               </w:pPr>
-              <w:hyperlink w:anchor="_Toc213770174" w:history="1">
+              <w:hyperlink w:anchor="_Toc213951420" w:history="1">
                 <w:r>
                   <w:rPr>
                     <w:rStyle w:val="Hipervnculo"/>
@@ -1120,7 +1122,7 @@
                     <w:noProof/>
                     <w:webHidden/>
                   </w:rPr>
-                  <w:instrText xml:space="preserve"> PAGEREF _Toc213770174 \h </w:instrText>
+                  <w:instrText xml:space="preserve"> PAGEREF _Toc213951420 \h </w:instrText>
                 </w:r>
                 <w:r>
                   <w:rPr>
@@ -1140,7 +1142,7 @@
                     <w:noProof/>
                     <w:webHidden/>
                   </w:rPr>
-                  <w:t>5</w:t>
+                  <w:t>6</w:t>
                 </w:r>
                 <w:r>
                   <w:rPr>
@@ -1163,7 +1165,7 @@
                   <w:lang w:eastAsia="es-ES"/>
                 </w:rPr>
               </w:pPr>
-              <w:hyperlink w:anchor="_Toc213770175" w:history="1">
+              <w:hyperlink w:anchor="_Toc213951421" w:history="1">
                 <w:r>
                   <w:rPr>
                     <w:rStyle w:val="Hipervnculo"/>
@@ -1190,7 +1192,7 @@
                     <w:noProof/>
                     <w:webHidden/>
                   </w:rPr>
-                  <w:instrText xml:space="preserve"> PAGEREF _Toc213770175 \h </w:instrText>
+                  <w:instrText xml:space="preserve"> PAGEREF _Toc213951421 \h </w:instrText>
                 </w:r>
                 <w:r>
                   <w:rPr>
@@ -1210,7 +1212,7 @@
                     <w:noProof/>
                     <w:webHidden/>
                   </w:rPr>
-                  <w:t>5</w:t>
+                  <w:t>6</w:t>
                 </w:r>
                 <w:r>
                   <w:rPr>
@@ -1233,7 +1235,7 @@
                   <w:lang w:eastAsia="es-ES"/>
                 </w:rPr>
               </w:pPr>
-              <w:hyperlink w:anchor="_Toc213770176" w:history="1">
+              <w:hyperlink w:anchor="_Toc213951422" w:history="1">
                 <w:r>
                   <w:rPr>
                     <w:rStyle w:val="Hipervnculo"/>
@@ -1260,7 +1262,7 @@
                     <w:noProof/>
                     <w:webHidden/>
                   </w:rPr>
-                  <w:instrText xml:space="preserve"> PAGEREF _Toc213770176 \h </w:instrText>
+                  <w:instrText xml:space="preserve"> PAGEREF _Toc213951422 \h </w:instrText>
                 </w:r>
                 <w:r>
                   <w:rPr>
@@ -1280,7 +1282,7 @@
                     <w:noProof/>
                     <w:webHidden/>
                   </w:rPr>
-                  <w:t>6</w:t>
+                  <w:t>7</w:t>
                 </w:r>
                 <w:r>
                   <w:rPr>
@@ -1303,7 +1305,7 @@
                   <w:lang w:eastAsia="es-ES"/>
                 </w:rPr>
               </w:pPr>
-              <w:hyperlink w:anchor="_Toc213770177" w:history="1">
+              <w:hyperlink w:anchor="_Toc213951423" w:history="1">
                 <w:r>
                   <w:rPr>
                     <w:rStyle w:val="Hipervnculo"/>
@@ -1330,7 +1332,7 @@
                     <w:noProof/>
                     <w:webHidden/>
                   </w:rPr>
-                  <w:instrText xml:space="preserve"> PAGEREF _Toc213770177 \h </w:instrText>
+                  <w:instrText xml:space="preserve"> PAGEREF _Toc213951423 \h </w:instrText>
                 </w:r>
                 <w:r>
                   <w:rPr>
@@ -1350,7 +1352,7 @@
                     <w:noProof/>
                     <w:webHidden/>
                   </w:rPr>
-                  <w:t>6</w:t>
+                  <w:t>7</w:t>
                 </w:r>
                 <w:r>
                   <w:rPr>
@@ -1373,7 +1375,7 @@
                   <w:lang w:eastAsia="es-ES"/>
                 </w:rPr>
               </w:pPr>
-              <w:hyperlink w:anchor="_Toc213770178" w:history="1">
+              <w:hyperlink w:anchor="_Toc213951424" w:history="1">
                 <w:r>
                   <w:rPr>
                     <w:rStyle w:val="Hipervnculo"/>
@@ -1400,7 +1402,7 @@
                     <w:noProof/>
                     <w:webHidden/>
                   </w:rPr>
-                  <w:instrText xml:space="preserve"> PAGEREF _Toc213770178 \h </w:instrText>
+                  <w:instrText xml:space="preserve"> PAGEREF _Toc213951424 \h </w:instrText>
                 </w:r>
                 <w:r>
                   <w:rPr>
@@ -1420,7 +1422,7 @@
                     <w:noProof/>
                     <w:webHidden/>
                   </w:rPr>
-                  <w:t>7</w:t>
+                  <w:t>8</w:t>
                 </w:r>
                 <w:r>
                   <w:rPr>
@@ -1443,7 +1445,7 @@
                   <w:lang w:eastAsia="es-ES"/>
                 </w:rPr>
               </w:pPr>
-              <w:hyperlink w:anchor="_Toc213770179" w:history="1">
+              <w:hyperlink w:anchor="_Toc213951425" w:history="1">
                 <w:r>
                   <w:rPr>
                     <w:rStyle w:val="Hipervnculo"/>
@@ -1470,7 +1472,7 @@
                     <w:noProof/>
                     <w:webHidden/>
                   </w:rPr>
-                  <w:instrText xml:space="preserve"> PAGEREF _Toc213770179 \h </w:instrText>
+                  <w:instrText xml:space="preserve"> PAGEREF _Toc213951425 \h </w:instrText>
                 </w:r>
                 <w:r>
                   <w:rPr>
@@ -1490,7 +1492,7 @@
                     <w:noProof/>
                     <w:webHidden/>
                   </w:rPr>
-                  <w:t>7</w:t>
+                  <w:t>8</w:t>
                 </w:r>
                 <w:r>
                   <w:rPr>
@@ -1513,7 +1515,7 @@
                   <w:lang w:eastAsia="es-ES"/>
                 </w:rPr>
               </w:pPr>
-              <w:hyperlink w:anchor="_Toc213770180" w:history="1">
+              <w:hyperlink w:anchor="_Toc213951426" w:history="1">
                 <w:r>
                   <w:rPr>
                     <w:rStyle w:val="Hipervnculo"/>
@@ -1540,7 +1542,7 @@
                     <w:noProof/>
                     <w:webHidden/>
                   </w:rPr>
-                  <w:instrText xml:space="preserve"> PAGEREF _Toc213770180 \h </w:instrText>
+                  <w:instrText xml:space="preserve"> PAGEREF _Toc213951426 \h </w:instrText>
                 </w:r>
                 <w:r>
                   <w:rPr>
@@ -1560,7 +1562,7 @@
                     <w:noProof/>
                     <w:webHidden/>
                   </w:rPr>
-                  <w:t>7</w:t>
+                  <w:t>8</w:t>
                 </w:r>
                 <w:r>
                   <w:rPr>
@@ -1583,7 +1585,7 @@
                   <w:lang w:eastAsia="es-ES"/>
                 </w:rPr>
               </w:pPr>
-              <w:hyperlink w:anchor="_Toc213770181" w:history="1">
+              <w:hyperlink w:anchor="_Toc213951427" w:history="1">
                 <w:r>
                   <w:rPr>
                     <w:rStyle w:val="Hipervnculo"/>
@@ -1610,7 +1612,7 @@
                     <w:noProof/>
                     <w:webHidden/>
                   </w:rPr>
-                  <w:instrText xml:space="preserve"> PAGEREF _Toc213770181 \h </w:instrText>
+                  <w:instrText xml:space="preserve"> PAGEREF _Toc213951427 \h </w:instrText>
                 </w:r>
                 <w:r>
                   <w:rPr>
@@ -1630,7 +1632,7 @@
                     <w:noProof/>
                     <w:webHidden/>
                   </w:rPr>
-                  <w:t>7</w:t>
+                  <w:t>8</w:t>
                 </w:r>
                 <w:r>
                   <w:rPr>
@@ -1653,7 +1655,7 @@
                   <w:lang w:eastAsia="es-ES"/>
                 </w:rPr>
               </w:pPr>
-              <w:hyperlink w:anchor="_Toc213770182" w:history="1">
+              <w:hyperlink w:anchor="_Toc213951428" w:history="1">
                 <w:r>
                   <w:rPr>
                     <w:rStyle w:val="Hipervnculo"/>
@@ -1680,7 +1682,7 @@
                     <w:noProof/>
                     <w:webHidden/>
                   </w:rPr>
-                  <w:instrText xml:space="preserve"> PAGEREF _Toc213770182 \h </w:instrText>
+                  <w:instrText xml:space="preserve"> PAGEREF _Toc213951428 \h </w:instrText>
                 </w:r>
                 <w:r>
                   <w:rPr>
@@ -1700,7 +1702,7 @@
                     <w:noProof/>
                     <w:webHidden/>
                   </w:rPr>
-                  <w:t>8</w:t>
+                  <w:t>9</w:t>
                 </w:r>
                 <w:r>
                   <w:rPr>
@@ -1723,7 +1725,7 @@
                   <w:lang w:eastAsia="es-ES"/>
                 </w:rPr>
               </w:pPr>
-              <w:hyperlink w:anchor="_Toc213770183" w:history="1">
+              <w:hyperlink w:anchor="_Toc213951429" w:history="1">
                 <w:r>
                   <w:rPr>
                     <w:rStyle w:val="Hipervnculo"/>
@@ -1750,7 +1752,7 @@
                     <w:noProof/>
                     <w:webHidden/>
                   </w:rPr>
-                  <w:instrText xml:space="preserve"> PAGEREF _Toc213770183 \h </w:instrText>
+                  <w:instrText xml:space="preserve"> PAGEREF _Toc213951429 \h </w:instrText>
                 </w:r>
                 <w:r>
                   <w:rPr>
@@ -1770,7 +1772,7 @@
                     <w:noProof/>
                     <w:webHidden/>
                   </w:rPr>
-                  <w:t>8</w:t>
+                  <w:t>9</w:t>
                 </w:r>
                 <w:r>
                   <w:rPr>
@@ -1793,7 +1795,7 @@
                   <w:lang w:eastAsia="es-ES"/>
                 </w:rPr>
               </w:pPr>
-              <w:hyperlink w:anchor="_Toc213770184" w:history="1">
+              <w:hyperlink w:anchor="_Toc213951430" w:history="1">
                 <w:r>
                   <w:rPr>
                     <w:rStyle w:val="Hipervnculo"/>
@@ -1820,7 +1822,7 @@
                     <w:noProof/>
                     <w:webHidden/>
                   </w:rPr>
-                  <w:instrText xml:space="preserve"> PAGEREF _Toc213770184 \h </w:instrText>
+                  <w:instrText xml:space="preserve"> PAGEREF _Toc213951430 \h </w:instrText>
                 </w:r>
                 <w:r>
                   <w:rPr>
@@ -1840,7 +1842,1678 @@
                     <w:noProof/>
                     <w:webHidden/>
                   </w:rPr>
-                  <w:t>8</w:t>
+                  <w:t>9</w:t>
+                </w:r>
+                <w:r>
+                  <w:rPr>
+                    <w:noProof/>
+                    <w:webHidden/>
+                  </w:rPr>
+                  <w:fldChar w:fldCharType="end"/>
+                </w:r>
+              </w:hyperlink>
+            </w:p>
+            <w:p>
+              <w:pPr>
+                <w:pStyle w:val="TDC1"/>
+                <w:tabs>
+                  <w:tab w:val="right" w:leader="dot" w:pos="8494"/>
+                </w:tabs>
+                <w:rPr>
+                  <w:rFonts w:eastAsiaTheme="minorEastAsia"/>
+                  <w:noProof/>
+                  <w:lang w:eastAsia="es-ES"/>
+                </w:rPr>
+              </w:pPr>
+              <w:hyperlink w:anchor="_Toc213951431" w:history="1">
+                <w:r>
+                  <w:rPr>
+                    <w:rStyle w:val="Hipervnculo"/>
+                    <w:noProof/>
+                  </w:rPr>
+                  <w:t>DESPLIEGUE APLICACIÓN PHP</w:t>
+                </w:r>
+                <w:r>
+                  <w:rPr>
+                    <w:noProof/>
+                    <w:webHidden/>
+                  </w:rPr>
+                  <w:tab/>
+                </w:r>
+                <w:r>
+                  <w:rPr>
+                    <w:noProof/>
+                    <w:webHidden/>
+                  </w:rPr>
+                  <w:fldChar w:fldCharType="begin"/>
+                </w:r>
+                <w:r>
+                  <w:rPr>
+                    <w:noProof/>
+                    <w:webHidden/>
+                  </w:rPr>
+                  <w:instrText xml:space="preserve"> PAGEREF _Toc213951431 \h </w:instrText>
+                </w:r>
+                <w:r>
+                  <w:rPr>
+                    <w:noProof/>
+                    <w:webHidden/>
+                  </w:rPr>
+                </w:r>
+                <w:r>
+                  <w:rPr>
+                    <w:noProof/>
+                    <w:webHidden/>
+                  </w:rPr>
+                  <w:fldChar w:fldCharType="separate"/>
+                </w:r>
+                <w:r>
+                  <w:rPr>
+                    <w:noProof/>
+                    <w:webHidden/>
+                  </w:rPr>
+                  <w:t>10</w:t>
+                </w:r>
+                <w:r>
+                  <w:rPr>
+                    <w:noProof/>
+                    <w:webHidden/>
+                  </w:rPr>
+                  <w:fldChar w:fldCharType="end"/>
+                </w:r>
+              </w:hyperlink>
+            </w:p>
+            <w:p>
+              <w:pPr>
+                <w:pStyle w:val="TDC2"/>
+                <w:tabs>
+                  <w:tab w:val="right" w:leader="dot" w:pos="8494"/>
+                </w:tabs>
+                <w:rPr>
+                  <w:rFonts w:eastAsiaTheme="minorEastAsia"/>
+                  <w:noProof/>
+                  <w:lang w:eastAsia="es-ES"/>
+                </w:rPr>
+              </w:pPr>
+              <w:hyperlink w:anchor="_Toc213951432" w:history="1">
+                <w:r>
+                  <w:rPr>
+                    <w:rStyle w:val="Hipervnculo"/>
+                    <w:noProof/>
+                  </w:rPr>
+                  <w:t>Instalación de módulos necesarios</w:t>
+                </w:r>
+                <w:r>
+                  <w:rPr>
+                    <w:noProof/>
+                    <w:webHidden/>
+                  </w:rPr>
+                  <w:tab/>
+                </w:r>
+                <w:r>
+                  <w:rPr>
+                    <w:noProof/>
+                    <w:webHidden/>
+                  </w:rPr>
+                  <w:fldChar w:fldCharType="begin"/>
+                </w:r>
+                <w:r>
+                  <w:rPr>
+                    <w:noProof/>
+                    <w:webHidden/>
+                  </w:rPr>
+                  <w:instrText xml:space="preserve"> PAGEREF _Toc213951432 \h </w:instrText>
+                </w:r>
+                <w:r>
+                  <w:rPr>
+                    <w:noProof/>
+                    <w:webHidden/>
+                  </w:rPr>
+                </w:r>
+                <w:r>
+                  <w:rPr>
+                    <w:noProof/>
+                    <w:webHidden/>
+                  </w:rPr>
+                  <w:fldChar w:fldCharType="separate"/>
+                </w:r>
+                <w:r>
+                  <w:rPr>
+                    <w:noProof/>
+                    <w:webHidden/>
+                  </w:rPr>
+                  <w:t>10</w:t>
+                </w:r>
+                <w:r>
+                  <w:rPr>
+                    <w:noProof/>
+                    <w:webHidden/>
+                  </w:rPr>
+                  <w:fldChar w:fldCharType="end"/>
+                </w:r>
+              </w:hyperlink>
+            </w:p>
+            <w:p>
+              <w:pPr>
+                <w:pStyle w:val="TDC3"/>
+                <w:tabs>
+                  <w:tab w:val="right" w:leader="dot" w:pos="8494"/>
+                </w:tabs>
+                <w:rPr>
+                  <w:rFonts w:eastAsiaTheme="minorEastAsia"/>
+                  <w:noProof/>
+                  <w:lang w:eastAsia="es-ES"/>
+                </w:rPr>
+              </w:pPr>
+              <w:hyperlink w:anchor="_Toc213951433" w:history="1">
+                <w:r>
+                  <w:rPr>
+                    <w:rStyle w:val="Hipervnculo"/>
+                    <w:noProof/>
+                  </w:rPr>
+                  <w:t>Instalación de php</w:t>
+                </w:r>
+                <w:r>
+                  <w:rPr>
+                    <w:noProof/>
+                    <w:webHidden/>
+                  </w:rPr>
+                  <w:tab/>
+                </w:r>
+                <w:r>
+                  <w:rPr>
+                    <w:noProof/>
+                    <w:webHidden/>
+                  </w:rPr>
+                  <w:fldChar w:fldCharType="begin"/>
+                </w:r>
+                <w:r>
+                  <w:rPr>
+                    <w:noProof/>
+                    <w:webHidden/>
+                  </w:rPr>
+                  <w:instrText xml:space="preserve"> PAGEREF _Toc213951433 \h </w:instrText>
+                </w:r>
+                <w:r>
+                  <w:rPr>
+                    <w:noProof/>
+                    <w:webHidden/>
+                  </w:rPr>
+                </w:r>
+                <w:r>
+                  <w:rPr>
+                    <w:noProof/>
+                    <w:webHidden/>
+                  </w:rPr>
+                  <w:fldChar w:fldCharType="separate"/>
+                </w:r>
+                <w:r>
+                  <w:rPr>
+                    <w:noProof/>
+                    <w:webHidden/>
+                  </w:rPr>
+                  <w:t>10</w:t>
+                </w:r>
+                <w:r>
+                  <w:rPr>
+                    <w:noProof/>
+                    <w:webHidden/>
+                  </w:rPr>
+                  <w:fldChar w:fldCharType="end"/>
+                </w:r>
+              </w:hyperlink>
+            </w:p>
+            <w:p>
+              <w:pPr>
+                <w:pStyle w:val="TDC3"/>
+                <w:tabs>
+                  <w:tab w:val="right" w:leader="dot" w:pos="8494"/>
+                </w:tabs>
+                <w:rPr>
+                  <w:rFonts w:eastAsiaTheme="minorEastAsia"/>
+                  <w:noProof/>
+                  <w:lang w:eastAsia="es-ES"/>
+                </w:rPr>
+              </w:pPr>
+              <w:hyperlink w:anchor="_Toc213951434" w:history="1">
+                <w:r>
+                  <w:rPr>
+                    <w:rStyle w:val="Hipervnculo"/>
+                    <w:noProof/>
+                  </w:rPr>
+                  <w:t>Instalación de libapache2-mod-php</w:t>
+                </w:r>
+                <w:r>
+                  <w:rPr>
+                    <w:noProof/>
+                    <w:webHidden/>
+                  </w:rPr>
+                  <w:tab/>
+                </w:r>
+                <w:r>
+                  <w:rPr>
+                    <w:noProof/>
+                    <w:webHidden/>
+                  </w:rPr>
+                  <w:fldChar w:fldCharType="begin"/>
+                </w:r>
+                <w:r>
+                  <w:rPr>
+                    <w:noProof/>
+                    <w:webHidden/>
+                  </w:rPr>
+                  <w:instrText xml:space="preserve"> PAGEREF _Toc213951434 \h </w:instrText>
+                </w:r>
+                <w:r>
+                  <w:rPr>
+                    <w:noProof/>
+                    <w:webHidden/>
+                  </w:rPr>
+                </w:r>
+                <w:r>
+                  <w:rPr>
+                    <w:noProof/>
+                    <w:webHidden/>
+                  </w:rPr>
+                  <w:fldChar w:fldCharType="separate"/>
+                </w:r>
+                <w:r>
+                  <w:rPr>
+                    <w:noProof/>
+                    <w:webHidden/>
+                  </w:rPr>
+                  <w:t>10</w:t>
+                </w:r>
+                <w:r>
+                  <w:rPr>
+                    <w:noProof/>
+                    <w:webHidden/>
+                  </w:rPr>
+                  <w:fldChar w:fldCharType="end"/>
+                </w:r>
+              </w:hyperlink>
+            </w:p>
+            <w:p>
+              <w:pPr>
+                <w:pStyle w:val="TDC3"/>
+                <w:tabs>
+                  <w:tab w:val="right" w:leader="dot" w:pos="8494"/>
+                </w:tabs>
+                <w:rPr>
+                  <w:rFonts w:eastAsiaTheme="minorEastAsia"/>
+                  <w:noProof/>
+                  <w:lang w:eastAsia="es-ES"/>
+                </w:rPr>
+              </w:pPr>
+              <w:hyperlink w:anchor="_Toc213951435" w:history="1">
+                <w:r>
+                  <w:rPr>
+                    <w:rStyle w:val="Hipervnculo"/>
+                    <w:noProof/>
+                  </w:rPr>
+                  <w:t>Instalación php-sqlite3</w:t>
+                </w:r>
+                <w:r>
+                  <w:rPr>
+                    <w:noProof/>
+                    <w:webHidden/>
+                  </w:rPr>
+                  <w:tab/>
+                </w:r>
+                <w:r>
+                  <w:rPr>
+                    <w:noProof/>
+                    <w:webHidden/>
+                  </w:rPr>
+                  <w:fldChar w:fldCharType="begin"/>
+                </w:r>
+                <w:r>
+                  <w:rPr>
+                    <w:noProof/>
+                    <w:webHidden/>
+                  </w:rPr>
+                  <w:instrText xml:space="preserve"> PAGEREF _Toc213951435 \h </w:instrText>
+                </w:r>
+                <w:r>
+                  <w:rPr>
+                    <w:noProof/>
+                    <w:webHidden/>
+                  </w:rPr>
+                </w:r>
+                <w:r>
+                  <w:rPr>
+                    <w:noProof/>
+                    <w:webHidden/>
+                  </w:rPr>
+                  <w:fldChar w:fldCharType="separate"/>
+                </w:r>
+                <w:r>
+                  <w:rPr>
+                    <w:noProof/>
+                    <w:webHidden/>
+                  </w:rPr>
+                  <w:t>10</w:t>
+                </w:r>
+                <w:r>
+                  <w:rPr>
+                    <w:noProof/>
+                    <w:webHidden/>
+                  </w:rPr>
+                  <w:fldChar w:fldCharType="end"/>
+                </w:r>
+              </w:hyperlink>
+            </w:p>
+            <w:p>
+              <w:pPr>
+                <w:pStyle w:val="TDC3"/>
+                <w:tabs>
+                  <w:tab w:val="right" w:leader="dot" w:pos="8494"/>
+                </w:tabs>
+                <w:rPr>
+                  <w:rFonts w:eastAsiaTheme="minorEastAsia"/>
+                  <w:noProof/>
+                  <w:lang w:eastAsia="es-ES"/>
+                </w:rPr>
+              </w:pPr>
+              <w:hyperlink w:anchor="_Toc213951436" w:history="1">
+                <w:r>
+                  <w:rPr>
+                    <w:rStyle w:val="Hipervnculo"/>
+                    <w:noProof/>
+                  </w:rPr>
+                  <w:t>Comprobación de que PHP está habilitado</w:t>
+                </w:r>
+                <w:r>
+                  <w:rPr>
+                    <w:noProof/>
+                    <w:webHidden/>
+                  </w:rPr>
+                  <w:tab/>
+                </w:r>
+                <w:r>
+                  <w:rPr>
+                    <w:noProof/>
+                    <w:webHidden/>
+                  </w:rPr>
+                  <w:fldChar w:fldCharType="begin"/>
+                </w:r>
+                <w:r>
+                  <w:rPr>
+                    <w:noProof/>
+                    <w:webHidden/>
+                  </w:rPr>
+                  <w:instrText xml:space="preserve"> PAGEREF _Toc213951436 \h </w:instrText>
+                </w:r>
+                <w:r>
+                  <w:rPr>
+                    <w:noProof/>
+                    <w:webHidden/>
+                  </w:rPr>
+                </w:r>
+                <w:r>
+                  <w:rPr>
+                    <w:noProof/>
+                    <w:webHidden/>
+                  </w:rPr>
+                  <w:fldChar w:fldCharType="separate"/>
+                </w:r>
+                <w:r>
+                  <w:rPr>
+                    <w:noProof/>
+                    <w:webHidden/>
+                  </w:rPr>
+                  <w:t>11</w:t>
+                </w:r>
+                <w:r>
+                  <w:rPr>
+                    <w:noProof/>
+                    <w:webHidden/>
+                  </w:rPr>
+                  <w:fldChar w:fldCharType="end"/>
+                </w:r>
+              </w:hyperlink>
+            </w:p>
+            <w:p>
+              <w:pPr>
+                <w:pStyle w:val="TDC2"/>
+                <w:tabs>
+                  <w:tab w:val="right" w:leader="dot" w:pos="8494"/>
+                </w:tabs>
+                <w:rPr>
+                  <w:rFonts w:eastAsiaTheme="minorEastAsia"/>
+                  <w:noProof/>
+                  <w:lang w:eastAsia="es-ES"/>
+                </w:rPr>
+              </w:pPr>
+              <w:hyperlink w:anchor="_Toc213951437" w:history="1">
+                <w:r>
+                  <w:rPr>
+                    <w:rStyle w:val="Hipervnculo"/>
+                    <w:noProof/>
+                  </w:rPr>
+                  <w:t>Creación de directorios y asignación de propietarios y permisos</w:t>
+                </w:r>
+                <w:r>
+                  <w:rPr>
+                    <w:noProof/>
+                    <w:webHidden/>
+                  </w:rPr>
+                  <w:tab/>
+                </w:r>
+                <w:r>
+                  <w:rPr>
+                    <w:noProof/>
+                    <w:webHidden/>
+                  </w:rPr>
+                  <w:fldChar w:fldCharType="begin"/>
+                </w:r>
+                <w:r>
+                  <w:rPr>
+                    <w:noProof/>
+                    <w:webHidden/>
+                  </w:rPr>
+                  <w:instrText xml:space="preserve"> PAGEREF _Toc213951437 \h </w:instrText>
+                </w:r>
+                <w:r>
+                  <w:rPr>
+                    <w:noProof/>
+                    <w:webHidden/>
+                  </w:rPr>
+                </w:r>
+                <w:r>
+                  <w:rPr>
+                    <w:noProof/>
+                    <w:webHidden/>
+                  </w:rPr>
+                  <w:fldChar w:fldCharType="separate"/>
+                </w:r>
+                <w:r>
+                  <w:rPr>
+                    <w:noProof/>
+                    <w:webHidden/>
+                  </w:rPr>
+                  <w:t>11</w:t>
+                </w:r>
+                <w:r>
+                  <w:rPr>
+                    <w:noProof/>
+                    <w:webHidden/>
+                  </w:rPr>
+                  <w:fldChar w:fldCharType="end"/>
+                </w:r>
+              </w:hyperlink>
+            </w:p>
+            <w:p>
+              <w:pPr>
+                <w:pStyle w:val="TDC3"/>
+                <w:tabs>
+                  <w:tab w:val="right" w:leader="dot" w:pos="8494"/>
+                </w:tabs>
+                <w:rPr>
+                  <w:rFonts w:eastAsiaTheme="minorEastAsia"/>
+                  <w:noProof/>
+                  <w:lang w:eastAsia="es-ES"/>
+                </w:rPr>
+              </w:pPr>
+              <w:hyperlink w:anchor="_Toc213951438" w:history="1">
+                <w:r>
+                  <w:rPr>
+                    <w:rStyle w:val="Hipervnculo"/>
+                    <w:noProof/>
+                  </w:rPr>
+                  <w:t>Listado del contenido de /var/www</w:t>
+                </w:r>
+                <w:r>
+                  <w:rPr>
+                    <w:noProof/>
+                    <w:webHidden/>
+                  </w:rPr>
+                  <w:tab/>
+                </w:r>
+                <w:r>
+                  <w:rPr>
+                    <w:noProof/>
+                    <w:webHidden/>
+                  </w:rPr>
+                  <w:fldChar w:fldCharType="begin"/>
+                </w:r>
+                <w:r>
+                  <w:rPr>
+                    <w:noProof/>
+                    <w:webHidden/>
+                  </w:rPr>
+                  <w:instrText xml:space="preserve"> PAGEREF _Toc213951438 \h </w:instrText>
+                </w:r>
+                <w:r>
+                  <w:rPr>
+                    <w:noProof/>
+                    <w:webHidden/>
+                  </w:rPr>
+                </w:r>
+                <w:r>
+                  <w:rPr>
+                    <w:noProof/>
+                    <w:webHidden/>
+                  </w:rPr>
+                  <w:fldChar w:fldCharType="separate"/>
+                </w:r>
+                <w:r>
+                  <w:rPr>
+                    <w:noProof/>
+                    <w:webHidden/>
+                  </w:rPr>
+                  <w:t>11</w:t>
+                </w:r>
+                <w:r>
+                  <w:rPr>
+                    <w:noProof/>
+                    <w:webHidden/>
+                  </w:rPr>
+                  <w:fldChar w:fldCharType="end"/>
+                </w:r>
+              </w:hyperlink>
+            </w:p>
+            <w:p>
+              <w:pPr>
+                <w:pStyle w:val="TDC3"/>
+                <w:tabs>
+                  <w:tab w:val="right" w:leader="dot" w:pos="8494"/>
+                </w:tabs>
+                <w:rPr>
+                  <w:rFonts w:eastAsiaTheme="minorEastAsia"/>
+                  <w:noProof/>
+                  <w:lang w:eastAsia="es-ES"/>
+                </w:rPr>
+              </w:pPr>
+              <w:hyperlink w:anchor="_Toc213951439" w:history="1">
+                <w:r>
+                  <w:rPr>
+                    <w:rStyle w:val="Hipervnculo"/>
+                    <w:noProof/>
+                  </w:rPr>
+                  <w:t>Listado del contenido de /var/data</w:t>
+                </w:r>
+                <w:r>
+                  <w:rPr>
+                    <w:noProof/>
+                    <w:webHidden/>
+                  </w:rPr>
+                  <w:tab/>
+                </w:r>
+                <w:r>
+                  <w:rPr>
+                    <w:noProof/>
+                    <w:webHidden/>
+                  </w:rPr>
+                  <w:fldChar w:fldCharType="begin"/>
+                </w:r>
+                <w:r>
+                  <w:rPr>
+                    <w:noProof/>
+                    <w:webHidden/>
+                  </w:rPr>
+                  <w:instrText xml:space="preserve"> PAGEREF _Toc213951439 \h </w:instrText>
+                </w:r>
+                <w:r>
+                  <w:rPr>
+                    <w:noProof/>
+                    <w:webHidden/>
+                  </w:rPr>
+                </w:r>
+                <w:r>
+                  <w:rPr>
+                    <w:noProof/>
+                    <w:webHidden/>
+                  </w:rPr>
+                  <w:fldChar w:fldCharType="separate"/>
+                </w:r>
+                <w:r>
+                  <w:rPr>
+                    <w:noProof/>
+                    <w:webHidden/>
+                  </w:rPr>
+                  <w:t>11</w:t>
+                </w:r>
+                <w:r>
+                  <w:rPr>
+                    <w:noProof/>
+                    <w:webHidden/>
+                  </w:rPr>
+                  <w:fldChar w:fldCharType="end"/>
+                </w:r>
+              </w:hyperlink>
+            </w:p>
+            <w:p>
+              <w:pPr>
+                <w:pStyle w:val="TDC2"/>
+                <w:tabs>
+                  <w:tab w:val="right" w:leader="dot" w:pos="8494"/>
+                </w:tabs>
+                <w:rPr>
+                  <w:rFonts w:eastAsiaTheme="minorEastAsia"/>
+                  <w:noProof/>
+                  <w:lang w:eastAsia="es-ES"/>
+                </w:rPr>
+              </w:pPr>
+              <w:hyperlink w:anchor="_Toc213951440" w:history="1">
+                <w:r>
+                  <w:rPr>
+                    <w:rStyle w:val="Hipervnculo"/>
+                    <w:noProof/>
+                  </w:rPr>
+                  <w:t>Copia de la aplicación al servidor</w:t>
+                </w:r>
+                <w:r>
+                  <w:rPr>
+                    <w:noProof/>
+                    <w:webHidden/>
+                  </w:rPr>
+                  <w:tab/>
+                </w:r>
+                <w:r>
+                  <w:rPr>
+                    <w:noProof/>
+                    <w:webHidden/>
+                  </w:rPr>
+                  <w:fldChar w:fldCharType="begin"/>
+                </w:r>
+                <w:r>
+                  <w:rPr>
+                    <w:noProof/>
+                    <w:webHidden/>
+                  </w:rPr>
+                  <w:instrText xml:space="preserve"> PAGEREF _Toc213951440 \h </w:instrText>
+                </w:r>
+                <w:r>
+                  <w:rPr>
+                    <w:noProof/>
+                    <w:webHidden/>
+                  </w:rPr>
+                </w:r>
+                <w:r>
+                  <w:rPr>
+                    <w:noProof/>
+                    <w:webHidden/>
+                  </w:rPr>
+                  <w:fldChar w:fldCharType="separate"/>
+                </w:r>
+                <w:r>
+                  <w:rPr>
+                    <w:noProof/>
+                    <w:webHidden/>
+                  </w:rPr>
+                  <w:t>12</w:t>
+                </w:r>
+                <w:r>
+                  <w:rPr>
+                    <w:noProof/>
+                    <w:webHidden/>
+                  </w:rPr>
+                  <w:fldChar w:fldCharType="end"/>
+                </w:r>
+              </w:hyperlink>
+            </w:p>
+            <w:p>
+              <w:pPr>
+                <w:pStyle w:val="TDC2"/>
+                <w:tabs>
+                  <w:tab w:val="right" w:leader="dot" w:pos="8494"/>
+                </w:tabs>
+                <w:rPr>
+                  <w:rFonts w:eastAsiaTheme="minorEastAsia"/>
+                  <w:noProof/>
+                  <w:lang w:eastAsia="es-ES"/>
+                </w:rPr>
+              </w:pPr>
+              <w:hyperlink w:anchor="_Toc213951441" w:history="1">
+                <w:r>
+                  <w:rPr>
+                    <w:rStyle w:val="Hipervnculo"/>
+                    <w:noProof/>
+                  </w:rPr>
+                  <w:t>Creación de un nuevo sitio virtual, y pruebas del sitio</w:t>
+                </w:r>
+                <w:r>
+                  <w:rPr>
+                    <w:noProof/>
+                    <w:webHidden/>
+                  </w:rPr>
+                  <w:tab/>
+                </w:r>
+                <w:r>
+                  <w:rPr>
+                    <w:noProof/>
+                    <w:webHidden/>
+                  </w:rPr>
+                  <w:fldChar w:fldCharType="begin"/>
+                </w:r>
+                <w:r>
+                  <w:rPr>
+                    <w:noProof/>
+                    <w:webHidden/>
+                  </w:rPr>
+                  <w:instrText xml:space="preserve"> PAGEREF _Toc213951441 \h </w:instrText>
+                </w:r>
+                <w:r>
+                  <w:rPr>
+                    <w:noProof/>
+                    <w:webHidden/>
+                  </w:rPr>
+                </w:r>
+                <w:r>
+                  <w:rPr>
+                    <w:noProof/>
+                    <w:webHidden/>
+                  </w:rPr>
+                  <w:fldChar w:fldCharType="separate"/>
+                </w:r>
+                <w:r>
+                  <w:rPr>
+                    <w:noProof/>
+                    <w:webHidden/>
+                  </w:rPr>
+                  <w:t>12</w:t>
+                </w:r>
+                <w:r>
+                  <w:rPr>
+                    <w:noProof/>
+                    <w:webHidden/>
+                  </w:rPr>
+                  <w:fldChar w:fldCharType="end"/>
+                </w:r>
+              </w:hyperlink>
+            </w:p>
+            <w:p>
+              <w:pPr>
+                <w:pStyle w:val="TDC2"/>
+                <w:tabs>
+                  <w:tab w:val="right" w:leader="dot" w:pos="8494"/>
+                </w:tabs>
+                <w:rPr>
+                  <w:rFonts w:eastAsiaTheme="minorEastAsia"/>
+                  <w:noProof/>
+                  <w:lang w:eastAsia="es-ES"/>
+                </w:rPr>
+              </w:pPr>
+              <w:hyperlink w:anchor="_Toc213951442" w:history="1">
+                <w:r>
+                  <w:rPr>
+                    <w:rStyle w:val="Hipervnculo"/>
+                    <w:noProof/>
+                  </w:rPr>
+                  <w:t>Posible depuración</w:t>
+                </w:r>
+                <w:r>
+                  <w:rPr>
+                    <w:noProof/>
+                    <w:webHidden/>
+                  </w:rPr>
+                  <w:tab/>
+                </w:r>
+                <w:r>
+                  <w:rPr>
+                    <w:noProof/>
+                    <w:webHidden/>
+                  </w:rPr>
+                  <w:fldChar w:fldCharType="begin"/>
+                </w:r>
+                <w:r>
+                  <w:rPr>
+                    <w:noProof/>
+                    <w:webHidden/>
+                  </w:rPr>
+                  <w:instrText xml:space="preserve"> PAGEREF _Toc213951442 \h </w:instrText>
+                </w:r>
+                <w:r>
+                  <w:rPr>
+                    <w:noProof/>
+                    <w:webHidden/>
+                  </w:rPr>
+                </w:r>
+                <w:r>
+                  <w:rPr>
+                    <w:noProof/>
+                    <w:webHidden/>
+                  </w:rPr>
+                  <w:fldChar w:fldCharType="separate"/>
+                </w:r>
+                <w:r>
+                  <w:rPr>
+                    <w:noProof/>
+                    <w:webHidden/>
+                  </w:rPr>
+                  <w:t>12</w:t>
+                </w:r>
+                <w:r>
+                  <w:rPr>
+                    <w:noProof/>
+                    <w:webHidden/>
+                  </w:rPr>
+                  <w:fldChar w:fldCharType="end"/>
+                </w:r>
+              </w:hyperlink>
+            </w:p>
+            <w:p>
+              <w:pPr>
+                <w:pStyle w:val="TDC1"/>
+                <w:tabs>
+                  <w:tab w:val="right" w:leader="dot" w:pos="8494"/>
+                </w:tabs>
+                <w:rPr>
+                  <w:rFonts w:eastAsiaTheme="minorEastAsia"/>
+                  <w:noProof/>
+                  <w:lang w:eastAsia="es-ES"/>
+                </w:rPr>
+              </w:pPr>
+              <w:hyperlink w:anchor="_Toc213951443" w:history="1">
+                <w:r>
+                  <w:rPr>
+                    <w:rStyle w:val="Hipervnculo"/>
+                    <w:noProof/>
+                  </w:rPr>
+                  <w:t>PROTECCIÓN HTTPS</w:t>
+                </w:r>
+                <w:r>
+                  <w:rPr>
+                    <w:noProof/>
+                    <w:webHidden/>
+                  </w:rPr>
+                  <w:tab/>
+                </w:r>
+                <w:r>
+                  <w:rPr>
+                    <w:noProof/>
+                    <w:webHidden/>
+                  </w:rPr>
+                  <w:fldChar w:fldCharType="begin"/>
+                </w:r>
+                <w:r>
+                  <w:rPr>
+                    <w:noProof/>
+                    <w:webHidden/>
+                  </w:rPr>
+                  <w:instrText xml:space="preserve"> PAGEREF _Toc213951443 \h </w:instrText>
+                </w:r>
+                <w:r>
+                  <w:rPr>
+                    <w:noProof/>
+                    <w:webHidden/>
+                  </w:rPr>
+                </w:r>
+                <w:r>
+                  <w:rPr>
+                    <w:noProof/>
+                    <w:webHidden/>
+                  </w:rPr>
+                  <w:fldChar w:fldCharType="separate"/>
+                </w:r>
+                <w:r>
+                  <w:rPr>
+                    <w:noProof/>
+                    <w:webHidden/>
+                  </w:rPr>
+                  <w:t>13</w:t>
+                </w:r>
+                <w:r>
+                  <w:rPr>
+                    <w:noProof/>
+                    <w:webHidden/>
+                  </w:rPr>
+                  <w:fldChar w:fldCharType="end"/>
+                </w:r>
+              </w:hyperlink>
+            </w:p>
+            <w:p>
+              <w:pPr>
+                <w:pStyle w:val="TDC2"/>
+                <w:tabs>
+                  <w:tab w:val="right" w:leader="dot" w:pos="8494"/>
+                </w:tabs>
+                <w:rPr>
+                  <w:rFonts w:eastAsiaTheme="minorEastAsia"/>
+                  <w:noProof/>
+                  <w:lang w:eastAsia="es-ES"/>
+                </w:rPr>
+              </w:pPr>
+              <w:hyperlink w:anchor="_Toc213951444" w:history="1">
+                <w:r>
+                  <w:rPr>
+                    <w:rStyle w:val="Hipervnculo"/>
+                    <w:noProof/>
+                  </w:rPr>
+                  <w:t>Obtención del certificado y configuración de Apache</w:t>
+                </w:r>
+                <w:r>
+                  <w:rPr>
+                    <w:noProof/>
+                    <w:webHidden/>
+                  </w:rPr>
+                  <w:tab/>
+                </w:r>
+                <w:r>
+                  <w:rPr>
+                    <w:noProof/>
+                    <w:webHidden/>
+                  </w:rPr>
+                  <w:fldChar w:fldCharType="begin"/>
+                </w:r>
+                <w:r>
+                  <w:rPr>
+                    <w:noProof/>
+                    <w:webHidden/>
+                  </w:rPr>
+                  <w:instrText xml:space="preserve"> PAGEREF _Toc213951444 \h </w:instrText>
+                </w:r>
+                <w:r>
+                  <w:rPr>
+                    <w:noProof/>
+                    <w:webHidden/>
+                  </w:rPr>
+                </w:r>
+                <w:r>
+                  <w:rPr>
+                    <w:noProof/>
+                    <w:webHidden/>
+                  </w:rPr>
+                  <w:fldChar w:fldCharType="separate"/>
+                </w:r>
+                <w:r>
+                  <w:rPr>
+                    <w:noProof/>
+                    <w:webHidden/>
+                  </w:rPr>
+                  <w:t>13</w:t>
+                </w:r>
+                <w:r>
+                  <w:rPr>
+                    <w:noProof/>
+                    <w:webHidden/>
+                  </w:rPr>
+                  <w:fldChar w:fldCharType="end"/>
+                </w:r>
+              </w:hyperlink>
+            </w:p>
+            <w:p>
+              <w:pPr>
+                <w:pStyle w:val="TDC2"/>
+                <w:tabs>
+                  <w:tab w:val="right" w:leader="dot" w:pos="8494"/>
+                </w:tabs>
+                <w:rPr>
+                  <w:rFonts w:eastAsiaTheme="minorEastAsia"/>
+                  <w:noProof/>
+                  <w:lang w:eastAsia="es-ES"/>
+                </w:rPr>
+              </w:pPr>
+              <w:hyperlink w:anchor="_Toc213951445" w:history="1">
+                <w:r>
+                  <w:rPr>
+                    <w:rStyle w:val="Hipervnculo"/>
+                    <w:noProof/>
+                  </w:rPr>
+                  <w:t>Verificación de la configuración</w:t>
+                </w:r>
+                <w:r>
+                  <w:rPr>
+                    <w:noProof/>
+                    <w:webHidden/>
+                  </w:rPr>
+                  <w:tab/>
+                </w:r>
+                <w:r>
+                  <w:rPr>
+                    <w:noProof/>
+                    <w:webHidden/>
+                  </w:rPr>
+                  <w:fldChar w:fldCharType="begin"/>
+                </w:r>
+                <w:r>
+                  <w:rPr>
+                    <w:noProof/>
+                    <w:webHidden/>
+                  </w:rPr>
+                  <w:instrText xml:space="preserve"> PAGEREF _Toc213951445 \h </w:instrText>
+                </w:r>
+                <w:r>
+                  <w:rPr>
+                    <w:noProof/>
+                    <w:webHidden/>
+                  </w:rPr>
+                </w:r>
+                <w:r>
+                  <w:rPr>
+                    <w:noProof/>
+                    <w:webHidden/>
+                  </w:rPr>
+                  <w:fldChar w:fldCharType="separate"/>
+                </w:r>
+                <w:r>
+                  <w:rPr>
+                    <w:noProof/>
+                    <w:webHidden/>
+                  </w:rPr>
+                  <w:t>14</w:t>
+                </w:r>
+                <w:r>
+                  <w:rPr>
+                    <w:noProof/>
+                    <w:webHidden/>
+                  </w:rPr>
+                  <w:fldChar w:fldCharType="end"/>
+                </w:r>
+              </w:hyperlink>
+            </w:p>
+            <w:p>
+              <w:pPr>
+                <w:pStyle w:val="TDC3"/>
+                <w:tabs>
+                  <w:tab w:val="right" w:leader="dot" w:pos="8494"/>
+                </w:tabs>
+                <w:rPr>
+                  <w:rFonts w:eastAsiaTheme="minorEastAsia"/>
+                  <w:noProof/>
+                  <w:lang w:eastAsia="es-ES"/>
+                </w:rPr>
+              </w:pPr>
+              <w:hyperlink w:anchor="_Toc213951446" w:history="1">
+                <w:r>
+                  <w:rPr>
+                    <w:rStyle w:val="Hipervnculo"/>
+                    <w:noProof/>
+                  </w:rPr>
+                  <w:t>Contenido del nuevo fichero creado por certbot</w:t>
+                </w:r>
+                <w:r>
+                  <w:rPr>
+                    <w:noProof/>
+                    <w:webHidden/>
+                  </w:rPr>
+                  <w:tab/>
+                </w:r>
+                <w:r>
+                  <w:rPr>
+                    <w:noProof/>
+                    <w:webHidden/>
+                  </w:rPr>
+                  <w:fldChar w:fldCharType="begin"/>
+                </w:r>
+                <w:r>
+                  <w:rPr>
+                    <w:noProof/>
+                    <w:webHidden/>
+                  </w:rPr>
+                  <w:instrText xml:space="preserve"> PAGEREF _Toc213951446 \h </w:instrText>
+                </w:r>
+                <w:r>
+                  <w:rPr>
+                    <w:noProof/>
+                    <w:webHidden/>
+                  </w:rPr>
+                </w:r>
+                <w:r>
+                  <w:rPr>
+                    <w:noProof/>
+                    <w:webHidden/>
+                  </w:rPr>
+                  <w:fldChar w:fldCharType="separate"/>
+                </w:r>
+                <w:r>
+                  <w:rPr>
+                    <w:noProof/>
+                    <w:webHidden/>
+                  </w:rPr>
+                  <w:t>14</w:t>
+                </w:r>
+                <w:r>
+                  <w:rPr>
+                    <w:noProof/>
+                    <w:webHidden/>
+                  </w:rPr>
+                  <w:fldChar w:fldCharType="end"/>
+                </w:r>
+              </w:hyperlink>
+            </w:p>
+            <w:p>
+              <w:pPr>
+                <w:pStyle w:val="TDC3"/>
+                <w:tabs>
+                  <w:tab w:val="right" w:leader="dot" w:pos="8494"/>
+                </w:tabs>
+                <w:rPr>
+                  <w:rFonts w:eastAsiaTheme="minorEastAsia"/>
+                  <w:noProof/>
+                  <w:lang w:eastAsia="es-ES"/>
+                </w:rPr>
+              </w:pPr>
+              <w:hyperlink w:anchor="_Toc213951447" w:history="1">
+                <w:r>
+                  <w:rPr>
+                    <w:rStyle w:val="Hipervnculo"/>
+                    <w:noProof/>
+                  </w:rPr>
+                  <w:t>Modificaciones introducidas en el fichero ya creado previamente</w:t>
+                </w:r>
+                <w:r>
+                  <w:rPr>
+                    <w:noProof/>
+                    <w:webHidden/>
+                  </w:rPr>
+                  <w:tab/>
+                </w:r>
+                <w:r>
+                  <w:rPr>
+                    <w:noProof/>
+                    <w:webHidden/>
+                  </w:rPr>
+                  <w:fldChar w:fldCharType="begin"/>
+                </w:r>
+                <w:r>
+                  <w:rPr>
+                    <w:noProof/>
+                    <w:webHidden/>
+                  </w:rPr>
+                  <w:instrText xml:space="preserve"> PAGEREF _Toc213951447 \h </w:instrText>
+                </w:r>
+                <w:r>
+                  <w:rPr>
+                    <w:noProof/>
+                    <w:webHidden/>
+                  </w:rPr>
+                </w:r>
+                <w:r>
+                  <w:rPr>
+                    <w:noProof/>
+                    <w:webHidden/>
+                  </w:rPr>
+                  <w:fldChar w:fldCharType="separate"/>
+                </w:r>
+                <w:r>
+                  <w:rPr>
+                    <w:noProof/>
+                    <w:webHidden/>
+                  </w:rPr>
+                  <w:t>15</w:t>
+                </w:r>
+                <w:r>
+                  <w:rPr>
+                    <w:noProof/>
+                    <w:webHidden/>
+                  </w:rPr>
+                  <w:fldChar w:fldCharType="end"/>
+                </w:r>
+              </w:hyperlink>
+            </w:p>
+            <w:p>
+              <w:pPr>
+                <w:pStyle w:val="TDC3"/>
+                <w:tabs>
+                  <w:tab w:val="right" w:leader="dot" w:pos="8494"/>
+                </w:tabs>
+                <w:rPr>
+                  <w:rFonts w:eastAsiaTheme="minorEastAsia"/>
+                  <w:noProof/>
+                  <w:lang w:eastAsia="es-ES"/>
+                </w:rPr>
+              </w:pPr>
+              <w:hyperlink w:anchor="_Toc213951448" w:history="1">
+                <w:r>
+                  <w:rPr>
+                    <w:rStyle w:val="Hipervnculo"/>
+                    <w:noProof/>
+                  </w:rPr>
+                  <w:t>Redirección y nueva petición HTTPS</w:t>
+                </w:r>
+                <w:r>
+                  <w:rPr>
+                    <w:noProof/>
+                    <w:webHidden/>
+                  </w:rPr>
+                  <w:tab/>
+                </w:r>
+                <w:r>
+                  <w:rPr>
+                    <w:noProof/>
+                    <w:webHidden/>
+                  </w:rPr>
+                  <w:fldChar w:fldCharType="begin"/>
+                </w:r>
+                <w:r>
+                  <w:rPr>
+                    <w:noProof/>
+                    <w:webHidden/>
+                  </w:rPr>
+                  <w:instrText xml:space="preserve"> PAGEREF _Toc213951448 \h </w:instrText>
+                </w:r>
+                <w:r>
+                  <w:rPr>
+                    <w:noProof/>
+                    <w:webHidden/>
+                  </w:rPr>
+                </w:r>
+                <w:r>
+                  <w:rPr>
+                    <w:noProof/>
+                    <w:webHidden/>
+                  </w:rPr>
+                  <w:fldChar w:fldCharType="separate"/>
+                </w:r>
+                <w:r>
+                  <w:rPr>
+                    <w:noProof/>
+                    <w:webHidden/>
+                  </w:rPr>
+                  <w:t>15</w:t>
+                </w:r>
+                <w:r>
+                  <w:rPr>
+                    <w:noProof/>
+                    <w:webHidden/>
+                  </w:rPr>
+                  <w:fldChar w:fldCharType="end"/>
+                </w:r>
+              </w:hyperlink>
+            </w:p>
+            <w:p>
+              <w:pPr>
+                <w:pStyle w:val="TDC3"/>
+                <w:tabs>
+                  <w:tab w:val="right" w:leader="dot" w:pos="8494"/>
+                </w:tabs>
+                <w:rPr>
+                  <w:rFonts w:eastAsiaTheme="minorEastAsia"/>
+                  <w:noProof/>
+                  <w:lang w:eastAsia="es-ES"/>
+                </w:rPr>
+              </w:pPr>
+              <w:hyperlink w:anchor="_Toc213951449" w:history="1">
+                <w:r>
+                  <w:rPr>
+                    <w:rStyle w:val="Hipervnculo"/>
+                    <w:noProof/>
+                  </w:rPr>
+                  <w:t xml:space="preserve">Comando </w:t>
+                </w:r>
+                <w:r>
+                  <w:rPr>
+                    <w:rStyle w:val="Hipervnculo"/>
+                    <w:i/>
+                    <w:iCs/>
+                    <w:noProof/>
+                  </w:rPr>
+                  <w:t>systemctl</w:t>
+                </w:r>
+                <w:r>
+                  <w:rPr>
+                    <w:rStyle w:val="Hipervnculo"/>
+                    <w:noProof/>
+                  </w:rPr>
+                  <w:t xml:space="preserve"> </w:t>
+                </w:r>
+                <w:r>
+                  <w:rPr>
+                    <w:rStyle w:val="Hipervnculo"/>
+                    <w:i/>
+                    <w:iCs/>
+                    <w:noProof/>
+                  </w:rPr>
+                  <w:t>list-timers | grep certbot</w:t>
+                </w:r>
+                <w:r>
+                  <w:rPr>
+                    <w:noProof/>
+                    <w:webHidden/>
+                  </w:rPr>
+                  <w:tab/>
+                </w:r>
+                <w:r>
+                  <w:rPr>
+                    <w:noProof/>
+                    <w:webHidden/>
+                  </w:rPr>
+                  <w:fldChar w:fldCharType="begin"/>
+                </w:r>
+                <w:r>
+                  <w:rPr>
+                    <w:noProof/>
+                    <w:webHidden/>
+                  </w:rPr>
+                  <w:instrText xml:space="preserve"> PAGEREF _Toc213951449 \h </w:instrText>
+                </w:r>
+                <w:r>
+                  <w:rPr>
+                    <w:noProof/>
+                    <w:webHidden/>
+                  </w:rPr>
+                </w:r>
+                <w:r>
+                  <w:rPr>
+                    <w:noProof/>
+                    <w:webHidden/>
+                  </w:rPr>
+                  <w:fldChar w:fldCharType="separate"/>
+                </w:r>
+                <w:r>
+                  <w:rPr>
+                    <w:noProof/>
+                    <w:webHidden/>
+                  </w:rPr>
+                  <w:t>15</w:t>
+                </w:r>
+                <w:r>
+                  <w:rPr>
+                    <w:noProof/>
+                    <w:webHidden/>
+                  </w:rPr>
+                  <w:fldChar w:fldCharType="end"/>
+                </w:r>
+              </w:hyperlink>
+            </w:p>
+            <w:p>
+              <w:pPr>
+                <w:pStyle w:val="TDC3"/>
+                <w:tabs>
+                  <w:tab w:val="right" w:leader="dot" w:pos="8494"/>
+                </w:tabs>
+                <w:rPr>
+                  <w:rFonts w:eastAsiaTheme="minorEastAsia"/>
+                  <w:noProof/>
+                  <w:lang w:eastAsia="es-ES"/>
+                </w:rPr>
+              </w:pPr>
+              <w:hyperlink w:anchor="_Toc213951450" w:history="1">
+                <w:r>
+                  <w:rPr>
+                    <w:rStyle w:val="Hipervnculo"/>
+                    <w:noProof/>
+                  </w:rPr>
+                  <w:t xml:space="preserve">Comando </w:t>
+                </w:r>
+                <w:r>
+                  <w:rPr>
+                    <w:rStyle w:val="Hipervnculo"/>
+                    <w:i/>
+                    <w:iCs/>
+                    <w:noProof/>
+                  </w:rPr>
+                  <w:t>cat certbot.timer</w:t>
+                </w:r>
+                <w:r>
+                  <w:rPr>
+                    <w:noProof/>
+                    <w:webHidden/>
+                  </w:rPr>
+                  <w:tab/>
+                </w:r>
+                <w:r>
+                  <w:rPr>
+                    <w:noProof/>
+                    <w:webHidden/>
+                  </w:rPr>
+                  <w:fldChar w:fldCharType="begin"/>
+                </w:r>
+                <w:r>
+                  <w:rPr>
+                    <w:noProof/>
+                    <w:webHidden/>
+                  </w:rPr>
+                  <w:instrText xml:space="preserve"> PAGEREF _Toc213951450 \h </w:instrText>
+                </w:r>
+                <w:r>
+                  <w:rPr>
+                    <w:noProof/>
+                    <w:webHidden/>
+                  </w:rPr>
+                </w:r>
+                <w:r>
+                  <w:rPr>
+                    <w:noProof/>
+                    <w:webHidden/>
+                  </w:rPr>
+                  <w:fldChar w:fldCharType="separate"/>
+                </w:r>
+                <w:r>
+                  <w:rPr>
+                    <w:noProof/>
+                    <w:webHidden/>
+                  </w:rPr>
+                  <w:t>16</w:t>
+                </w:r>
+                <w:r>
+                  <w:rPr>
+                    <w:noProof/>
+                    <w:webHidden/>
+                  </w:rPr>
+                  <w:fldChar w:fldCharType="end"/>
+                </w:r>
+              </w:hyperlink>
+            </w:p>
+            <w:p>
+              <w:pPr>
+                <w:pStyle w:val="TDC3"/>
+                <w:tabs>
+                  <w:tab w:val="right" w:leader="dot" w:pos="8494"/>
+                </w:tabs>
+                <w:rPr>
+                  <w:rFonts w:eastAsiaTheme="minorEastAsia"/>
+                  <w:noProof/>
+                  <w:lang w:eastAsia="es-ES"/>
+                </w:rPr>
+              </w:pPr>
+              <w:hyperlink w:anchor="_Toc213951451" w:history="1">
+                <w:r>
+                  <w:rPr>
+                    <w:rStyle w:val="Hipervnculo"/>
+                    <w:noProof/>
+                  </w:rPr>
+                  <w:t xml:space="preserve">Comando </w:t>
+                </w:r>
+                <w:r>
+                  <w:rPr>
+                    <w:rStyle w:val="Hipervnculo"/>
+                    <w:i/>
+                    <w:iCs/>
+                    <w:noProof/>
+                  </w:rPr>
+                  <w:t>systemctl status certbot.timer</w:t>
+                </w:r>
+                <w:r>
+                  <w:rPr>
+                    <w:noProof/>
+                    <w:webHidden/>
+                  </w:rPr>
+                  <w:tab/>
+                </w:r>
+                <w:r>
+                  <w:rPr>
+                    <w:noProof/>
+                    <w:webHidden/>
+                  </w:rPr>
+                  <w:fldChar w:fldCharType="begin"/>
+                </w:r>
+                <w:r>
+                  <w:rPr>
+                    <w:noProof/>
+                    <w:webHidden/>
+                  </w:rPr>
+                  <w:instrText xml:space="preserve"> PAGEREF _Toc213951451 \h </w:instrText>
+                </w:r>
+                <w:r>
+                  <w:rPr>
+                    <w:noProof/>
+                    <w:webHidden/>
+                  </w:rPr>
+                </w:r>
+                <w:r>
+                  <w:rPr>
+                    <w:noProof/>
+                    <w:webHidden/>
+                  </w:rPr>
+                  <w:fldChar w:fldCharType="separate"/>
+                </w:r>
+                <w:r>
+                  <w:rPr>
+                    <w:noProof/>
+                    <w:webHidden/>
+                  </w:rPr>
+                  <w:t>16</w:t>
+                </w:r>
+                <w:r>
+                  <w:rPr>
+                    <w:noProof/>
+                    <w:webHidden/>
+                  </w:rPr>
+                  <w:fldChar w:fldCharType="end"/>
+                </w:r>
+              </w:hyperlink>
+            </w:p>
+            <w:p>
+              <w:pPr>
+                <w:pStyle w:val="TDC3"/>
+                <w:tabs>
+                  <w:tab w:val="right" w:leader="dot" w:pos="8494"/>
+                </w:tabs>
+                <w:rPr>
+                  <w:rFonts w:eastAsiaTheme="minorEastAsia"/>
+                  <w:noProof/>
+                  <w:lang w:eastAsia="es-ES"/>
+                </w:rPr>
+              </w:pPr>
+              <w:hyperlink w:anchor="_Toc213951452" w:history="1">
+                <w:r>
+                  <w:rPr>
+                    <w:rStyle w:val="Hipervnculo"/>
+                    <w:noProof/>
+                  </w:rPr>
+                  <w:t xml:space="preserve">Comando </w:t>
+                </w:r>
+                <w:r>
+                  <w:rPr>
+                    <w:rStyle w:val="Hipervnculo"/>
+                    <w:i/>
+                    <w:iCs/>
+                    <w:noProof/>
+                  </w:rPr>
+                  <w:t>systemctl cat certbot.service</w:t>
+                </w:r>
+                <w:r>
+                  <w:rPr>
+                    <w:noProof/>
+                    <w:webHidden/>
+                  </w:rPr>
+                  <w:tab/>
+                </w:r>
+                <w:r>
+                  <w:rPr>
+                    <w:noProof/>
+                    <w:webHidden/>
+                  </w:rPr>
+                  <w:fldChar w:fldCharType="begin"/>
+                </w:r>
+                <w:r>
+                  <w:rPr>
+                    <w:noProof/>
+                    <w:webHidden/>
+                  </w:rPr>
+                  <w:instrText xml:space="preserve"> PAGEREF _Toc213951452 \h </w:instrText>
+                </w:r>
+                <w:r>
+                  <w:rPr>
+                    <w:noProof/>
+                    <w:webHidden/>
+                  </w:rPr>
+                </w:r>
+                <w:r>
+                  <w:rPr>
+                    <w:noProof/>
+                    <w:webHidden/>
+                  </w:rPr>
+                  <w:fldChar w:fldCharType="separate"/>
+                </w:r>
+                <w:r>
+                  <w:rPr>
+                    <w:noProof/>
+                    <w:webHidden/>
+                  </w:rPr>
+                  <w:t>16</w:t>
+                </w:r>
+                <w:r>
+                  <w:rPr>
+                    <w:noProof/>
+                    <w:webHidden/>
+                  </w:rPr>
+                  <w:fldChar w:fldCharType="end"/>
+                </w:r>
+              </w:hyperlink>
+            </w:p>
+            <w:p>
+              <w:pPr>
+                <w:pStyle w:val="TDC3"/>
+                <w:tabs>
+                  <w:tab w:val="right" w:leader="dot" w:pos="8494"/>
+                </w:tabs>
+                <w:rPr>
+                  <w:rFonts w:eastAsiaTheme="minorEastAsia"/>
+                  <w:noProof/>
+                  <w:lang w:eastAsia="es-ES"/>
+                </w:rPr>
+              </w:pPr>
+              <w:hyperlink w:anchor="_Toc213951453" w:history="1">
+                <w:r>
+                  <w:rPr>
+                    <w:rStyle w:val="Hipervnculo"/>
+                    <w:noProof/>
+                  </w:rPr>
+                  <w:t xml:space="preserve">Comando </w:t>
+                </w:r>
+                <w:r>
+                  <w:rPr>
+                    <w:rStyle w:val="Hipervnculo"/>
+                    <w:i/>
+                    <w:iCs/>
+                    <w:noProof/>
+                  </w:rPr>
+                  <w:t>sudo certbot renew --dry-run</w:t>
+                </w:r>
+                <w:r>
+                  <w:rPr>
+                    <w:noProof/>
+                    <w:webHidden/>
+                  </w:rPr>
+                  <w:tab/>
+                </w:r>
+                <w:r>
+                  <w:rPr>
+                    <w:noProof/>
+                    <w:webHidden/>
+                  </w:rPr>
+                  <w:fldChar w:fldCharType="begin"/>
+                </w:r>
+                <w:r>
+                  <w:rPr>
+                    <w:noProof/>
+                    <w:webHidden/>
+                  </w:rPr>
+                  <w:instrText xml:space="preserve"> PAGEREF _Toc213951453 \h </w:instrText>
+                </w:r>
+                <w:r>
+                  <w:rPr>
+                    <w:noProof/>
+                    <w:webHidden/>
+                  </w:rPr>
+                </w:r>
+                <w:r>
+                  <w:rPr>
+                    <w:noProof/>
+                    <w:webHidden/>
+                  </w:rPr>
+                  <w:fldChar w:fldCharType="separate"/>
+                </w:r>
+                <w:r>
+                  <w:rPr>
+                    <w:noProof/>
+                    <w:webHidden/>
+                  </w:rPr>
+                  <w:t>17</w:t>
                 </w:r>
                 <w:r>
                   <w:rPr>
@@ -1879,7 +3552,7 @@
         <w:br w:type="page"/>
       </w:r>
     </w:p>
-    <w:bookmarkStart w:id="0" w:name="_Toc213770163"/>
+    <w:bookmarkStart w:id="0" w:name="_Toc213951409"/>
     <w:p>
       <w:pPr>
         <w:pStyle w:val="Ttulo1"/>
@@ -1906,7 +3579,7 @@
       <w:pPr>
         <w:pStyle w:val="Ttulo2"/>
       </w:pPr>
-      <w:bookmarkStart w:id="1" w:name="_Toc213770164"/>
+      <w:bookmarkStart w:id="1" w:name="_Toc213951410"/>
       <w:r>
         <w:t>Instalación de Apache</w:t>
       </w:r>
@@ -1962,7 +3635,7 @@
       <w:pPr>
         <w:pStyle w:val="Ttulo2"/>
       </w:pPr>
-      <w:bookmarkStart w:id="2" w:name="_Toc213770165"/>
+      <w:bookmarkStart w:id="2" w:name="_Toc213951411"/>
       <w:r>
         <w:t>Comprobación de los cambios realizados en el sistema</w:t>
       </w:r>
@@ -2024,7 +3697,7 @@
       <w:pPr>
         <w:pStyle w:val="Ttulo2"/>
       </w:pPr>
-      <w:bookmarkStart w:id="3" w:name="_Toc213770166"/>
+      <w:bookmarkStart w:id="3" w:name="_Toc213951412"/>
       <w:r>
         <w:lastRenderedPageBreak/>
         <w:t>Verificar que Apache está corriendo, desde el mismo servidor</w:t>
@@ -2035,7 +3708,7 @@
       <w:pPr>
         <w:pStyle w:val="Ttulo3"/>
       </w:pPr>
-      <w:bookmarkStart w:id="4" w:name="_Toc213770167"/>
+      <w:bookmarkStart w:id="4" w:name="_Toc213951413"/>
       <w:r>
         <w:t>Petición con el comando telnet</w:t>
       </w:r>
@@ -2092,7 +3765,7 @@
       <w:pPr>
         <w:pStyle w:val="Ttulo3"/>
       </w:pPr>
-      <w:bookmarkStart w:id="5" w:name="_Toc213770168"/>
+      <w:bookmarkStart w:id="5" w:name="_Toc213951414"/>
       <w:r>
         <w:t>Petición con el comando wget</w:t>
       </w:r>
@@ -2149,7 +3822,7 @@
       <w:pPr>
         <w:pStyle w:val="Ttulo2"/>
       </w:pPr>
-      <w:bookmarkStart w:id="6" w:name="_Toc213770169"/>
+      <w:bookmarkStart w:id="6" w:name="_Toc213951415"/>
       <w:r>
         <w:t>Verificar que Apache está corriendo, desde un cliente externo</w:t>
       </w:r>
@@ -2205,7 +3878,7 @@
       <w:pPr>
         <w:pStyle w:val="Ttulo2"/>
       </w:pPr>
-      <w:bookmarkStart w:id="7" w:name="_Toc213770170"/>
+      <w:bookmarkStart w:id="7" w:name="_Toc213951416"/>
       <w:r>
         <w:lastRenderedPageBreak/>
         <w:t>Modificar la página por defecto de Apache</w:t>
@@ -2268,7 +3941,7 @@
       <w:pPr>
         <w:pStyle w:val="Ttulo1"/>
       </w:pPr>
-      <w:bookmarkStart w:id="8" w:name="_Toc213770171"/>
+      <w:bookmarkStart w:id="8" w:name="_Toc213951417"/>
       <w:r>
         <w:t>CREACIÓN DE SITIOS VIRTUALES</w:t>
       </w:r>
@@ -2278,7 +3951,7 @@
       <w:pPr>
         <w:pStyle w:val="Ttulo2"/>
       </w:pPr>
-      <w:bookmarkStart w:id="9" w:name="_Toc213770172"/>
+      <w:bookmarkStart w:id="9" w:name="_Toc213951418"/>
       <w:r>
         <w:t>Configurar nombre DNS en Azure, y recopilar información para configuración DNS</w:t>
       </w:r>
@@ -2331,7 +4004,7 @@
       <w:pPr>
         <w:pStyle w:val="Ttulo2"/>
       </w:pPr>
-      <w:bookmarkStart w:id="10" w:name="_Toc213770173"/>
+      <w:bookmarkStart w:id="10" w:name="_Toc213951419"/>
       <w:r>
         <w:lastRenderedPageBreak/>
         <w:t>Crear directorios para los nuevos sitios</w:t>
@@ -2384,7 +4057,7 @@
       <w:pPr>
         <w:pStyle w:val="Ttulo2"/>
       </w:pPr>
-      <w:bookmarkStart w:id="11" w:name="_Toc213770174"/>
+      <w:bookmarkStart w:id="11" w:name="_Toc213951420"/>
       <w:r>
         <w:t>Crear y personalizar ficheros de configuración de los nuevos servidores virtuales</w:t>
       </w:r>
@@ -2394,16 +4067,11 @@
       <w:pPr>
         <w:pStyle w:val="Ttulo3"/>
       </w:pPr>
-      <w:bookmarkStart w:id="12" w:name="_Toc213770175"/>
-      <w:r>
-        <w:t xml:space="preserve">Fichero </w:t>
-      </w:r>
-      <w:proofErr w:type="spellStart"/>
-      <w:r>
-        <w:t>ports.conf</w:t>
+      <w:bookmarkStart w:id="12" w:name="_Toc213951421"/>
+      <w:r>
+        <w:t>Fichero ports.conf</w:t>
       </w:r>
       <w:bookmarkEnd w:id="12"/>
-      <w:proofErr w:type="spellEnd"/>
     </w:p>
     <w:p>
       <w:r>
@@ -2451,7 +4119,7 @@
       <w:pPr>
         <w:pStyle w:val="Ttulo3"/>
       </w:pPr>
-      <w:bookmarkStart w:id="13" w:name="_Toc213770176"/>
+      <w:bookmarkStart w:id="13" w:name="_Toc213951422"/>
       <w:r>
         <w:lastRenderedPageBreak/>
         <w:t>Fichero port-9009.conf</w:t>
@@ -2504,7 +4172,7 @@
       <w:pPr>
         <w:pStyle w:val="Ttulo3"/>
       </w:pPr>
-      <w:bookmarkStart w:id="14" w:name="_Toc213770177"/>
+      <w:bookmarkStart w:id="14" w:name="_Toc213951423"/>
       <w:r>
         <w:t>Fichero jesusdr-da2d1e.conf</w:t>
       </w:r>
@@ -2556,7 +4224,7 @@
       <w:pPr>
         <w:pStyle w:val="Ttulo3"/>
       </w:pPr>
-      <w:bookmarkStart w:id="15" w:name="_Toc213770178"/>
+      <w:bookmarkStart w:id="15" w:name="_Toc213951424"/>
       <w:r>
         <w:lastRenderedPageBreak/>
         <w:t>Fichero jesusdr-da2d1e-port-7007</w:t>
@@ -2609,7 +4277,7 @@
       <w:pPr>
         <w:pStyle w:val="Ttulo2"/>
       </w:pPr>
-      <w:bookmarkStart w:id="16" w:name="_Toc213770179"/>
+      <w:bookmarkStart w:id="16" w:name="_Toc213951425"/>
       <w:r>
         <w:t>Probar los sitios virtuales</w:t>
       </w:r>
@@ -2619,7 +4287,7 @@
       <w:pPr>
         <w:pStyle w:val="Ttulo3"/>
       </w:pPr>
-      <w:bookmarkStart w:id="17" w:name="_Toc213770180"/>
+      <w:bookmarkStart w:id="17" w:name="_Toc213951426"/>
       <w:r>
         <w:t>Sitio por defecto</w:t>
       </w:r>
@@ -2671,7 +4339,7 @@
       <w:pPr>
         <w:pStyle w:val="Ttulo3"/>
       </w:pPr>
-      <w:bookmarkStart w:id="18" w:name="_Toc213770181"/>
+      <w:bookmarkStart w:id="18" w:name="_Toc213951427"/>
       <w:r>
         <w:t>Sitio por el puerto 9009</w:t>
       </w:r>
@@ -2723,7 +4391,7 @@
       <w:pPr>
         <w:pStyle w:val="Ttulo3"/>
       </w:pPr>
-      <w:bookmarkStart w:id="19" w:name="_Toc213770182"/>
+      <w:bookmarkStart w:id="19" w:name="_Toc213951428"/>
       <w:r>
         <w:lastRenderedPageBreak/>
         <w:t>Sitio por el nombre (</w:t>
@@ -2787,7 +4455,7 @@
       <w:pPr>
         <w:pStyle w:val="Ttulo3"/>
       </w:pPr>
-      <w:bookmarkStart w:id="20" w:name="_Toc213770183"/>
+      <w:bookmarkStart w:id="20" w:name="_Toc213951429"/>
       <w:r>
         <w:t>Sitio por el nombre y el puerto 7007</w:t>
       </w:r>
@@ -2839,7 +4507,7 @@
       <w:pPr>
         <w:pStyle w:val="Ttulo3"/>
       </w:pPr>
-      <w:bookmarkStart w:id="21" w:name="_Toc213770184"/>
+      <w:bookmarkStart w:id="21" w:name="_Toc213951430"/>
       <w:r>
         <w:t>Sitio por el nombre (</w:t>
       </w:r>
@@ -2897,34 +4565,38 @@
       <w:pPr>
         <w:pStyle w:val="Ttulo1"/>
       </w:pPr>
+      <w:bookmarkStart w:id="22" w:name="_Toc213951431"/>
       <w:r>
         <w:lastRenderedPageBreak/>
         <w:t>DESPLIEGUE APLICACIÓN PHP</w:t>
       </w:r>
+      <w:bookmarkEnd w:id="22"/>
     </w:p>
     <w:p>
       <w:pPr>
         <w:pStyle w:val="Ttulo2"/>
       </w:pPr>
+      <w:bookmarkStart w:id="23" w:name="_Toc213951432"/>
       <w:r>
         <w:t>Instalación de módulos necesarios</w:t>
       </w:r>
+      <w:bookmarkEnd w:id="23"/>
     </w:p>
     <w:p>
       <w:pPr>
         <w:pStyle w:val="Ttulo3"/>
       </w:pPr>
-      <w:r>
-        <w:t xml:space="preserve">Instalación de </w:t>
-      </w:r>
-      <w:proofErr w:type="spellStart"/>
-      <w:r>
-        <w:t>php</w:t>
-      </w:r>
-      <w:proofErr w:type="spellEnd"/>
-    </w:p>
-    <w:p>
-      <w:r>
+      <w:bookmarkStart w:id="24" w:name="_Toc213951433"/>
+      <w:r>
+        <w:t>Instalación de php</w:t>
+      </w:r>
+      <w:bookmarkEnd w:id="24"/>
+    </w:p>
+    <w:p>
+      <w:r>
+        <w:rPr>
+          <w:noProof/>
+        </w:rPr>
         <w:drawing>
           <wp:inline distT="0" distB="0" distL="0" distR="0" wp14:anchorId="2EE45CDD" wp14:editId="0396F7C4">
             <wp:extent cx="5400040" cy="2038350"/>
@@ -2966,12 +4638,17 @@
       <w:pPr>
         <w:pStyle w:val="Ttulo3"/>
       </w:pPr>
+      <w:bookmarkStart w:id="25" w:name="_Toc213951434"/>
       <w:r>
         <w:t>Instalación de libapache2-mod-php</w:t>
       </w:r>
-    </w:p>
-    <w:p>
-      <w:r>
+      <w:bookmarkEnd w:id="25"/>
+    </w:p>
+    <w:p>
+      <w:r>
+        <w:rPr>
+          <w:noProof/>
+        </w:rPr>
         <w:drawing>
           <wp:inline distT="0" distB="0" distL="0" distR="0" wp14:anchorId="049E0586" wp14:editId="14FC3F11">
             <wp:extent cx="5400040" cy="2162175"/>
@@ -3013,12 +4690,17 @@
       <w:pPr>
         <w:pStyle w:val="Ttulo3"/>
       </w:pPr>
+      <w:bookmarkStart w:id="26" w:name="_Toc213951435"/>
       <w:r>
         <w:t>Instalación php-sqlite3</w:t>
       </w:r>
-    </w:p>
-    <w:p>
-      <w:r>
+      <w:bookmarkEnd w:id="26"/>
+    </w:p>
+    <w:p>
+      <w:r>
+        <w:rPr>
+          <w:noProof/>
+        </w:rPr>
         <w:drawing>
           <wp:inline distT="0" distB="0" distL="0" distR="0" wp14:anchorId="24159689" wp14:editId="4B84B1EF">
             <wp:extent cx="5400040" cy="1887855"/>
@@ -3060,10 +4742,12 @@
       <w:pPr>
         <w:pStyle w:val="Ttulo3"/>
       </w:pPr>
+      <w:bookmarkStart w:id="27" w:name="_Toc213951436"/>
       <w:r>
         <w:lastRenderedPageBreak/>
         <w:t>Comprobación de que PHP está habilitado</w:t>
       </w:r>
+      <w:bookmarkEnd w:id="27"/>
     </w:p>
     <w:p>
       <w:r>
@@ -3149,6 +4833,9 @@
         </mc:AlternateContent>
       </w:r>
       <w:r>
+        <w:rPr>
+          <w:noProof/>
+        </w:rPr>
         <w:drawing>
           <wp:inline distT="0" distB="0" distL="0" distR="0" wp14:anchorId="02F99A8A" wp14:editId="1ABB32A1">
             <wp:extent cx="5400040" cy="3990975"/>
@@ -3190,20 +4877,27 @@
       <w:pPr>
         <w:pStyle w:val="Ttulo2"/>
       </w:pPr>
+      <w:bookmarkStart w:id="28" w:name="_Toc213951437"/>
       <w:r>
         <w:t>Creación de directorios y asignación de propietarios y permisos</w:t>
       </w:r>
+      <w:bookmarkEnd w:id="28"/>
     </w:p>
     <w:p>
       <w:pPr>
         <w:pStyle w:val="Ttulo3"/>
       </w:pPr>
+      <w:bookmarkStart w:id="29" w:name="_Toc213951438"/>
       <w:r>
         <w:t>Listado del contenido de /var/www</w:t>
       </w:r>
-    </w:p>
-    <w:p>
-      <w:r>
+      <w:bookmarkEnd w:id="29"/>
+    </w:p>
+    <w:p>
+      <w:r>
+        <w:rPr>
+          <w:noProof/>
+        </w:rPr>
         <w:drawing>
           <wp:inline distT="0" distB="0" distL="0" distR="0" wp14:anchorId="3AE22EA4" wp14:editId="0C141837">
             <wp:extent cx="5068007" cy="1857634"/>
@@ -3245,12 +4939,17 @@
       <w:pPr>
         <w:pStyle w:val="Ttulo3"/>
       </w:pPr>
+      <w:bookmarkStart w:id="30" w:name="_Toc213951439"/>
       <w:r>
         <w:t>Listado del contenido de /var/data</w:t>
       </w:r>
-    </w:p>
-    <w:p>
-      <w:r>
+      <w:bookmarkEnd w:id="30"/>
+    </w:p>
+    <w:p>
+      <w:r>
+        <w:rPr>
+          <w:noProof/>
+        </w:rPr>
         <w:drawing>
           <wp:inline distT="0" distB="0" distL="0" distR="0" wp14:anchorId="20DBA769" wp14:editId="40013169">
             <wp:extent cx="4706007" cy="1209844"/>
@@ -3292,13 +4991,18 @@
       <w:pPr>
         <w:pStyle w:val="Ttulo2"/>
       </w:pPr>
+      <w:bookmarkStart w:id="31" w:name="_Toc213951440"/>
       <w:r>
         <w:lastRenderedPageBreak/>
         <w:t>Copia de la aplicación al servidor</w:t>
       </w:r>
-    </w:p>
-    <w:p>
-      <w:r>
+      <w:bookmarkEnd w:id="31"/>
+    </w:p>
+    <w:p>
+      <w:r>
+        <w:rPr>
+          <w:noProof/>
+        </w:rPr>
         <w:drawing>
           <wp:inline distT="0" distB="0" distL="0" distR="0" wp14:anchorId="24A4FD3F" wp14:editId="489DC985">
             <wp:extent cx="5400040" cy="2078990"/>
@@ -3340,11 +5044,675 @@
       <w:pPr>
         <w:pStyle w:val="Ttulo2"/>
       </w:pPr>
+      <w:bookmarkStart w:id="32" w:name="_Toc213951441"/>
       <w:r>
         <w:t>Creación de un nuevo sitio virtual, y pruebas del sitio</w:t>
       </w:r>
+      <w:bookmarkEnd w:id="32"/>
+    </w:p>
+    <w:p>
+      <w:r>
+        <w:rPr>
+          <w:noProof/>
+        </w:rPr>
+        <w:drawing>
+          <wp:inline distT="0" distB="0" distL="0" distR="0" wp14:anchorId="63ECF218" wp14:editId="2C804B74">
+            <wp:extent cx="5400040" cy="1682115"/>
+            <wp:effectExtent l="0" t="0" r="0" b="0"/>
+            <wp:docPr id="159040627" name="Imagen 1" descr="Interfaz de usuario gráfica, Aplicación&#10;&#10;El contenido generado por IA puede ser incorrecto."/>
+            <wp:cNvGraphicFramePr>
+              <a:graphicFrameLocks xmlns:a="http://schemas.openxmlformats.org/drawingml/2006/main" noChangeAspect="1"/>
+            </wp:cNvGraphicFramePr>
+            <a:graphic xmlns:a="http://schemas.openxmlformats.org/drawingml/2006/main">
+              <a:graphicData uri="http://schemas.openxmlformats.org/drawingml/2006/picture">
+                <pic:pic xmlns:pic="http://schemas.openxmlformats.org/drawingml/2006/picture">
+                  <pic:nvPicPr>
+                    <pic:cNvPr id="159040627" name="Imagen 1" descr="Interfaz de usuario gráfica, Aplicación&#10;&#10;El contenido generado por IA puede ser incorrecto."/>
+                    <pic:cNvPicPr/>
+                  </pic:nvPicPr>
+                  <pic:blipFill>
+                    <a:blip r:embed="rId31"/>
+                    <a:stretch>
+                      <a:fillRect/>
+                    </a:stretch>
+                  </pic:blipFill>
+                  <pic:spPr>
+                    <a:xfrm>
+                      <a:off x="0" y="0"/>
+                      <a:ext cx="5400040" cy="1682115"/>
+                    </a:xfrm>
+                    <a:prstGeom prst="rect">
+                      <a:avLst/>
+                    </a:prstGeom>
+                  </pic:spPr>
+                </pic:pic>
+              </a:graphicData>
+            </a:graphic>
+          </wp:inline>
+        </w:drawing>
+      </w:r>
+    </w:p>
+    <w:p>
+      <w:pPr>
+        <w:pStyle w:val="Ttulo2"/>
+      </w:pPr>
+      <w:bookmarkStart w:id="33" w:name="_Toc213951442"/>
+      <w:r>
+        <w:t>Posible depuración</w:t>
+      </w:r>
+      <w:bookmarkEnd w:id="33"/>
+    </w:p>
+    <w:p>
+      <w:pPr>
+        <w:pStyle w:val="Prrafodelista"/>
+        <w:numPr>
+          <w:ilvl w:val="0"/>
+          <w:numId w:val="2"/>
+        </w:numPr>
+      </w:pPr>
+      <w:r>
+        <w:t>Error de la dirección de la BBDD: modificar dentro del servidor en cada página necesaria la dirección con la nueva dirección ‘</w:t>
+      </w:r>
+      <w:r>
+        <w:rPr>
+          <w:i/>
+          <w:iCs/>
+        </w:rPr>
+        <w:t>/var/data/eventos-app/calendar.db</w:t>
+      </w:r>
+      <w:r>
+        <w:t>’.</w:t>
+      </w:r>
+    </w:p>
+    <w:p>
+      <w:pPr>
+        <w:pStyle w:val="Prrafodelista"/>
+        <w:numPr>
+          <w:ilvl w:val="0"/>
+          <w:numId w:val="2"/>
+        </w:numPr>
+      </w:pPr>
+      <w:r>
+        <w:t>Error de permisos de los ficheros de la aplicación: modificar los permisos con el comando ‘</w:t>
+      </w:r>
+      <w:r>
+        <w:rPr>
+          <w:i/>
+          <w:iCs/>
+        </w:rPr>
+        <w:t>chmod -R 755 /var/www/eventos-app</w:t>
+      </w:r>
+      <w:r>
+        <w:t>’.</w:t>
+      </w:r>
+    </w:p>
+    <w:p>
+      <w:pPr>
+        <w:pStyle w:val="Prrafodelista"/>
+        <w:numPr>
+          <w:ilvl w:val="0"/>
+          <w:numId w:val="2"/>
+        </w:numPr>
+      </w:pPr>
+      <w:r>
+        <w:t xml:space="preserve">Error con el propietario de la carpeta </w:t>
+      </w:r>
+      <w:r>
+        <w:rPr>
+          <w:i/>
+          <w:iCs/>
+        </w:rPr>
+        <w:t>data</w:t>
+      </w:r>
+      <w:r>
+        <w:t xml:space="preserve"> y sus ficheros: modificar el propietario con el comando ‘</w:t>
+      </w:r>
+      <w:r>
+        <w:rPr>
+          <w:i/>
+          <w:iCs/>
+        </w:rPr>
+        <w:t>chmod -R www-data:www-data /var/data</w:t>
+      </w:r>
+      <w:r>
+        <w:t>’.</w:t>
+      </w:r>
+    </w:p>
+    <w:p>
+      <w:pPr>
+        <w:pStyle w:val="Prrafodelista"/>
+        <w:numPr>
+          <w:ilvl w:val="0"/>
+          <w:numId w:val="2"/>
+        </w:numPr>
+      </w:pPr>
+      <w:r>
+        <w:t>Error con alguna dirección de enlaces: modificarla a la correcta, teniendo en cuenta que tienen que ser direcciones relativas.</w:t>
+      </w:r>
     </w:p>
     <w:p/>
+    <w:p>
+      <w:pPr>
+        <w:pStyle w:val="Ttulo1"/>
+      </w:pPr>
+      <w:bookmarkStart w:id="34" w:name="_Toc213951443"/>
+      <w:r>
+        <w:lastRenderedPageBreak/>
+        <w:t>PROTECCIÓN HTTPS</w:t>
+      </w:r>
+      <w:bookmarkEnd w:id="34"/>
+    </w:p>
+    <w:p>
+      <w:pPr>
+        <w:pStyle w:val="Ttulo2"/>
+      </w:pPr>
+      <w:bookmarkStart w:id="35" w:name="_Toc213951444"/>
+      <w:r>
+        <w:t>Obtención del certificado y configuración de Apache</w:t>
+      </w:r>
+      <w:bookmarkEnd w:id="35"/>
+    </w:p>
+    <w:p>
+      <w:r>
+        <w:drawing>
+          <wp:inline distT="0" distB="0" distL="0" distR="0" wp14:anchorId="75F4E334" wp14:editId="7719C897">
+            <wp:extent cx="5400040" cy="4725035"/>
+            <wp:effectExtent l="0" t="0" r="0" b="0"/>
+            <wp:docPr id="1888361048" name="Imagen 1" descr="Texto&#10;&#10;El contenido generado por IA puede ser incorrecto."/>
+            <wp:cNvGraphicFramePr>
+              <a:graphicFrameLocks xmlns:a="http://schemas.openxmlformats.org/drawingml/2006/main" noChangeAspect="1"/>
+            </wp:cNvGraphicFramePr>
+            <a:graphic xmlns:a="http://schemas.openxmlformats.org/drawingml/2006/main">
+              <a:graphicData uri="http://schemas.openxmlformats.org/drawingml/2006/picture">
+                <pic:pic xmlns:pic="http://schemas.openxmlformats.org/drawingml/2006/picture">
+                  <pic:nvPicPr>
+                    <pic:cNvPr id="1888361048" name="Imagen 1" descr="Texto&#10;&#10;El contenido generado por IA puede ser incorrecto."/>
+                    <pic:cNvPicPr/>
+                  </pic:nvPicPr>
+                  <pic:blipFill>
+                    <a:blip r:embed="rId32"/>
+                    <a:stretch>
+                      <a:fillRect/>
+                    </a:stretch>
+                  </pic:blipFill>
+                  <pic:spPr>
+                    <a:xfrm>
+                      <a:off x="0" y="0"/>
+                      <a:ext cx="5400040" cy="4725035"/>
+                    </a:xfrm>
+                    <a:prstGeom prst="rect">
+                      <a:avLst/>
+                    </a:prstGeom>
+                  </pic:spPr>
+                </pic:pic>
+              </a:graphicData>
+            </a:graphic>
+          </wp:inline>
+        </w:drawing>
+      </w:r>
+    </w:p>
+    <w:p>
+      <w:pPr>
+        <w:pStyle w:val="Ttulo2"/>
+      </w:pPr>
+      <w:bookmarkStart w:id="36" w:name="_Toc213951445"/>
+      <w:r>
+        <w:lastRenderedPageBreak/>
+        <w:t>Verificación de la configuración</w:t>
+      </w:r>
+      <w:bookmarkEnd w:id="36"/>
+    </w:p>
+    <w:p>
+      <w:pPr>
+        <w:pStyle w:val="Ttulo3"/>
+      </w:pPr>
+      <w:bookmarkStart w:id="37" w:name="_Toc213951446"/>
+      <w:r>
+        <w:t>Contenido del nuevo fichero creado por certbot</w:t>
+      </w:r>
+      <w:bookmarkEnd w:id="37"/>
+    </w:p>
+    <w:p>
+      <w:r>
+        <w:drawing>
+          <wp:inline distT="0" distB="0" distL="0" distR="0" wp14:anchorId="0813522C" wp14:editId="58418668">
+            <wp:extent cx="5400040" cy="5407660"/>
+            <wp:effectExtent l="0" t="0" r="0" b="2540"/>
+            <wp:docPr id="1053745328" name="Imagen 1" descr="Texto&#10;&#10;El contenido generado por IA puede ser incorrecto."/>
+            <wp:cNvGraphicFramePr>
+              <a:graphicFrameLocks xmlns:a="http://schemas.openxmlformats.org/drawingml/2006/main" noChangeAspect="1"/>
+            </wp:cNvGraphicFramePr>
+            <a:graphic xmlns:a="http://schemas.openxmlformats.org/drawingml/2006/main">
+              <a:graphicData uri="http://schemas.openxmlformats.org/drawingml/2006/picture">
+                <pic:pic xmlns:pic="http://schemas.openxmlformats.org/drawingml/2006/picture">
+                  <pic:nvPicPr>
+                    <pic:cNvPr id="1053745328" name="Imagen 1" descr="Texto&#10;&#10;El contenido generado por IA puede ser incorrecto."/>
+                    <pic:cNvPicPr/>
+                  </pic:nvPicPr>
+                  <pic:blipFill>
+                    <a:blip r:embed="rId33"/>
+                    <a:stretch>
+                      <a:fillRect/>
+                    </a:stretch>
+                  </pic:blipFill>
+                  <pic:spPr>
+                    <a:xfrm>
+                      <a:off x="0" y="0"/>
+                      <a:ext cx="5400040" cy="5407660"/>
+                    </a:xfrm>
+                    <a:prstGeom prst="rect">
+                      <a:avLst/>
+                    </a:prstGeom>
+                  </pic:spPr>
+                </pic:pic>
+              </a:graphicData>
+            </a:graphic>
+          </wp:inline>
+        </w:drawing>
+      </w:r>
+    </w:p>
+    <w:p>
+      <w:pPr>
+        <w:pStyle w:val="Ttulo3"/>
+      </w:pPr>
+      <w:bookmarkStart w:id="38" w:name="_Toc213951447"/>
+      <w:r>
+        <w:lastRenderedPageBreak/>
+        <w:t>Modificaciones introducidas en el fichero ya creado previamente</w:t>
+      </w:r>
+      <w:bookmarkEnd w:id="38"/>
+    </w:p>
+    <w:p>
+      <w:r>
+        <w:drawing>
+          <wp:inline distT="0" distB="0" distL="0" distR="0" wp14:anchorId="32927B05" wp14:editId="013FF0B8">
+            <wp:extent cx="5400040" cy="4656455"/>
+            <wp:effectExtent l="0" t="0" r="0" b="0"/>
+            <wp:docPr id="1927881668" name="Imagen 1" descr="Texto&#10;&#10;El contenido generado por IA puede ser incorrecto."/>
+            <wp:cNvGraphicFramePr>
+              <a:graphicFrameLocks xmlns:a="http://schemas.openxmlformats.org/drawingml/2006/main" noChangeAspect="1"/>
+            </wp:cNvGraphicFramePr>
+            <a:graphic xmlns:a="http://schemas.openxmlformats.org/drawingml/2006/main">
+              <a:graphicData uri="http://schemas.openxmlformats.org/drawingml/2006/picture">
+                <pic:pic xmlns:pic="http://schemas.openxmlformats.org/drawingml/2006/picture">
+                  <pic:nvPicPr>
+                    <pic:cNvPr id="1927881668" name="Imagen 1" descr="Texto&#10;&#10;El contenido generado por IA puede ser incorrecto."/>
+                    <pic:cNvPicPr/>
+                  </pic:nvPicPr>
+                  <pic:blipFill>
+                    <a:blip r:embed="rId34"/>
+                    <a:stretch>
+                      <a:fillRect/>
+                    </a:stretch>
+                  </pic:blipFill>
+                  <pic:spPr>
+                    <a:xfrm>
+                      <a:off x="0" y="0"/>
+                      <a:ext cx="5400040" cy="4656455"/>
+                    </a:xfrm>
+                    <a:prstGeom prst="rect">
+                      <a:avLst/>
+                    </a:prstGeom>
+                  </pic:spPr>
+                </pic:pic>
+              </a:graphicData>
+            </a:graphic>
+          </wp:inline>
+        </w:drawing>
+      </w:r>
+    </w:p>
+    <w:p>
+      <w:pPr>
+        <w:pStyle w:val="Ttulo3"/>
+      </w:pPr>
+      <w:bookmarkStart w:id="39" w:name="_Toc213951448"/>
+      <w:r>
+        <w:t>Redirección y nueva petición HTTPS</w:t>
+      </w:r>
+      <w:bookmarkEnd w:id="39"/>
+    </w:p>
+    <w:p>
+      <w:r>
+        <w:drawing>
+          <wp:inline distT="0" distB="0" distL="0" distR="0" wp14:anchorId="3AA5AC90" wp14:editId="2D69DC95">
+            <wp:extent cx="5400040" cy="1522730"/>
+            <wp:effectExtent l="0" t="0" r="0" b="1270"/>
+            <wp:docPr id="1600001588" name="Imagen 1" descr="Captura de pantalla de un videojuego&#10;&#10;El contenido generado por IA puede ser incorrecto."/>
+            <wp:cNvGraphicFramePr>
+              <a:graphicFrameLocks xmlns:a="http://schemas.openxmlformats.org/drawingml/2006/main" noChangeAspect="1"/>
+            </wp:cNvGraphicFramePr>
+            <a:graphic xmlns:a="http://schemas.openxmlformats.org/drawingml/2006/main">
+              <a:graphicData uri="http://schemas.openxmlformats.org/drawingml/2006/picture">
+                <pic:pic xmlns:pic="http://schemas.openxmlformats.org/drawingml/2006/picture">
+                  <pic:nvPicPr>
+                    <pic:cNvPr id="1600001588" name="Imagen 1" descr="Captura de pantalla de un videojuego&#10;&#10;El contenido generado por IA puede ser incorrecto."/>
+                    <pic:cNvPicPr/>
+                  </pic:nvPicPr>
+                  <pic:blipFill>
+                    <a:blip r:embed="rId35"/>
+                    <a:stretch>
+                      <a:fillRect/>
+                    </a:stretch>
+                  </pic:blipFill>
+                  <pic:spPr>
+                    <a:xfrm>
+                      <a:off x="0" y="0"/>
+                      <a:ext cx="5400040" cy="1522730"/>
+                    </a:xfrm>
+                    <a:prstGeom prst="rect">
+                      <a:avLst/>
+                    </a:prstGeom>
+                  </pic:spPr>
+                </pic:pic>
+              </a:graphicData>
+            </a:graphic>
+          </wp:inline>
+        </w:drawing>
+      </w:r>
+    </w:p>
+    <w:p>
+      <w:pPr>
+        <w:pStyle w:val="Ttulo3"/>
+      </w:pPr>
+      <w:bookmarkStart w:id="40" w:name="_Toc213951449"/>
+      <w:r>
+        <w:t xml:space="preserve">Comando </w:t>
+      </w:r>
+      <w:r>
+        <w:rPr>
+          <w:i/>
+          <w:iCs/>
+        </w:rPr>
+        <w:t>systemctl</w:t>
+      </w:r>
+      <w:r>
+        <w:t xml:space="preserve"> </w:t>
+      </w:r>
+      <w:r>
+        <w:rPr>
+          <w:i/>
+          <w:iCs/>
+        </w:rPr>
+        <w:t>list-timers</w:t>
+      </w:r>
+      <w:r>
+        <w:rPr>
+          <w:i/>
+          <w:iCs/>
+        </w:rPr>
+        <w:t xml:space="preserve"> | grep certbot</w:t>
+      </w:r>
+      <w:bookmarkEnd w:id="40"/>
+    </w:p>
+    <w:p>
+      <w:r>
+        <w:drawing>
+          <wp:inline distT="0" distB="0" distL="0" distR="0" wp14:anchorId="737472AA" wp14:editId="21A17E6A">
+            <wp:extent cx="5400040" cy="399415"/>
+            <wp:effectExtent l="0" t="0" r="0" b="635"/>
+            <wp:docPr id="212712711" name="Imagen 1"/>
+            <wp:cNvGraphicFramePr>
+              <a:graphicFrameLocks xmlns:a="http://schemas.openxmlformats.org/drawingml/2006/main" noChangeAspect="1"/>
+            </wp:cNvGraphicFramePr>
+            <a:graphic xmlns:a="http://schemas.openxmlformats.org/drawingml/2006/main">
+              <a:graphicData uri="http://schemas.openxmlformats.org/drawingml/2006/picture">
+                <pic:pic xmlns:pic="http://schemas.openxmlformats.org/drawingml/2006/picture">
+                  <pic:nvPicPr>
+                    <pic:cNvPr id="212712711" name=""/>
+                    <pic:cNvPicPr/>
+                  </pic:nvPicPr>
+                  <pic:blipFill>
+                    <a:blip r:embed="rId36"/>
+                    <a:stretch>
+                      <a:fillRect/>
+                    </a:stretch>
+                  </pic:blipFill>
+                  <pic:spPr>
+                    <a:xfrm>
+                      <a:off x="0" y="0"/>
+                      <a:ext cx="5400040" cy="399415"/>
+                    </a:xfrm>
+                    <a:prstGeom prst="rect">
+                      <a:avLst/>
+                    </a:prstGeom>
+                  </pic:spPr>
+                </pic:pic>
+              </a:graphicData>
+            </a:graphic>
+          </wp:inline>
+        </w:drawing>
+      </w:r>
+    </w:p>
+    <w:p>
+      <w:pPr>
+        <w:pStyle w:val="Ttulo3"/>
+      </w:pPr>
+      <w:bookmarkStart w:id="41" w:name="_Toc213951450"/>
+      <w:r>
+        <w:lastRenderedPageBreak/>
+        <w:t xml:space="preserve">Comando </w:t>
+      </w:r>
+      <w:r>
+        <w:rPr>
+          <w:i/>
+          <w:iCs/>
+        </w:rPr>
+        <w:t>cat certbot.timer</w:t>
+      </w:r>
+      <w:bookmarkEnd w:id="41"/>
+    </w:p>
+    <w:p>
+      <w:r>
+        <w:drawing>
+          <wp:inline distT="0" distB="0" distL="0" distR="0" wp14:anchorId="7E58064C" wp14:editId="3D331411">
+            <wp:extent cx="3791479" cy="2295845"/>
+            <wp:effectExtent l="0" t="0" r="0" b="9525"/>
+            <wp:docPr id="1351373680" name="Imagen 1" descr="Texto&#10;&#10;El contenido generado por IA puede ser incorrecto."/>
+            <wp:cNvGraphicFramePr>
+              <a:graphicFrameLocks xmlns:a="http://schemas.openxmlformats.org/drawingml/2006/main" noChangeAspect="1"/>
+            </wp:cNvGraphicFramePr>
+            <a:graphic xmlns:a="http://schemas.openxmlformats.org/drawingml/2006/main">
+              <a:graphicData uri="http://schemas.openxmlformats.org/drawingml/2006/picture">
+                <pic:pic xmlns:pic="http://schemas.openxmlformats.org/drawingml/2006/picture">
+                  <pic:nvPicPr>
+                    <pic:cNvPr id="1351373680" name="Imagen 1" descr="Texto&#10;&#10;El contenido generado por IA puede ser incorrecto."/>
+                    <pic:cNvPicPr/>
+                  </pic:nvPicPr>
+                  <pic:blipFill>
+                    <a:blip r:embed="rId37"/>
+                    <a:stretch>
+                      <a:fillRect/>
+                    </a:stretch>
+                  </pic:blipFill>
+                  <pic:spPr>
+                    <a:xfrm>
+                      <a:off x="0" y="0"/>
+                      <a:ext cx="3791479" cy="2295845"/>
+                    </a:xfrm>
+                    <a:prstGeom prst="rect">
+                      <a:avLst/>
+                    </a:prstGeom>
+                  </pic:spPr>
+                </pic:pic>
+              </a:graphicData>
+            </a:graphic>
+          </wp:inline>
+        </w:drawing>
+      </w:r>
+    </w:p>
+    <w:p>
+      <w:pPr>
+        <w:pStyle w:val="Ttulo3"/>
+        <w:rPr>
+          <w:i/>
+          <w:iCs/>
+        </w:rPr>
+      </w:pPr>
+      <w:bookmarkStart w:id="42" w:name="_Toc213951451"/>
+      <w:r>
+        <w:t xml:space="preserve">Comando </w:t>
+      </w:r>
+      <w:r>
+        <w:rPr>
+          <w:i/>
+          <w:iCs/>
+        </w:rPr>
+        <w:t>systemctl status certbot.timer</w:t>
+      </w:r>
+      <w:bookmarkEnd w:id="42"/>
+    </w:p>
+    <w:p>
+      <w:r>
+        <w:drawing>
+          <wp:inline distT="0" distB="0" distL="0" distR="0" wp14:anchorId="1348859E" wp14:editId="29512079">
+            <wp:extent cx="5400040" cy="1367155"/>
+            <wp:effectExtent l="0" t="0" r="0" b="4445"/>
+            <wp:docPr id="188086170" name="Imagen 1" descr="Texto&#10;&#10;El contenido generado por IA puede ser incorrecto."/>
+            <wp:cNvGraphicFramePr>
+              <a:graphicFrameLocks xmlns:a="http://schemas.openxmlformats.org/drawingml/2006/main" noChangeAspect="1"/>
+            </wp:cNvGraphicFramePr>
+            <a:graphic xmlns:a="http://schemas.openxmlformats.org/drawingml/2006/main">
+              <a:graphicData uri="http://schemas.openxmlformats.org/drawingml/2006/picture">
+                <pic:pic xmlns:pic="http://schemas.openxmlformats.org/drawingml/2006/picture">
+                  <pic:nvPicPr>
+                    <pic:cNvPr id="188086170" name="Imagen 1" descr="Texto&#10;&#10;El contenido generado por IA puede ser incorrecto."/>
+                    <pic:cNvPicPr/>
+                  </pic:nvPicPr>
+                  <pic:blipFill>
+                    <a:blip r:embed="rId38"/>
+                    <a:stretch>
+                      <a:fillRect/>
+                    </a:stretch>
+                  </pic:blipFill>
+                  <pic:spPr>
+                    <a:xfrm>
+                      <a:off x="0" y="0"/>
+                      <a:ext cx="5400040" cy="1367155"/>
+                    </a:xfrm>
+                    <a:prstGeom prst="rect">
+                      <a:avLst/>
+                    </a:prstGeom>
+                  </pic:spPr>
+                </pic:pic>
+              </a:graphicData>
+            </a:graphic>
+          </wp:inline>
+        </w:drawing>
+      </w:r>
+    </w:p>
+    <w:p>
+      <w:pPr>
+        <w:pStyle w:val="Ttulo3"/>
+      </w:pPr>
+      <w:bookmarkStart w:id="43" w:name="_Toc213951452"/>
+      <w:r>
+        <w:t xml:space="preserve">Comando </w:t>
+      </w:r>
+      <w:r>
+        <w:rPr>
+          <w:i/>
+          <w:iCs/>
+        </w:rPr>
+        <w:t>systemctl cat certbot.service</w:t>
+      </w:r>
+      <w:bookmarkEnd w:id="43"/>
+    </w:p>
+    <w:p>
+      <w:r>
+        <w:drawing>
+          <wp:inline distT="0" distB="0" distL="0" distR="0" wp14:anchorId="7C8FEA9F" wp14:editId="129C6B5C">
+            <wp:extent cx="5382376" cy="2019582"/>
+            <wp:effectExtent l="0" t="0" r="0" b="0"/>
+            <wp:docPr id="94004366" name="Imagen 1" descr="Texto&#10;&#10;El contenido generado por IA puede ser incorrecto."/>
+            <wp:cNvGraphicFramePr>
+              <a:graphicFrameLocks xmlns:a="http://schemas.openxmlformats.org/drawingml/2006/main" noChangeAspect="1"/>
+            </wp:cNvGraphicFramePr>
+            <a:graphic xmlns:a="http://schemas.openxmlformats.org/drawingml/2006/main">
+              <a:graphicData uri="http://schemas.openxmlformats.org/drawingml/2006/picture">
+                <pic:pic xmlns:pic="http://schemas.openxmlformats.org/drawingml/2006/picture">
+                  <pic:nvPicPr>
+                    <pic:cNvPr id="94004366" name="Imagen 1" descr="Texto&#10;&#10;El contenido generado por IA puede ser incorrecto."/>
+                    <pic:cNvPicPr/>
+                  </pic:nvPicPr>
+                  <pic:blipFill>
+                    <a:blip r:embed="rId39"/>
+                    <a:stretch>
+                      <a:fillRect/>
+                    </a:stretch>
+                  </pic:blipFill>
+                  <pic:spPr>
+                    <a:xfrm>
+                      <a:off x="0" y="0"/>
+                      <a:ext cx="5382376" cy="2019582"/>
+                    </a:xfrm>
+                    <a:prstGeom prst="rect">
+                      <a:avLst/>
+                    </a:prstGeom>
+                  </pic:spPr>
+                </pic:pic>
+              </a:graphicData>
+            </a:graphic>
+          </wp:inline>
+        </w:drawing>
+      </w:r>
+    </w:p>
+    <w:p>
+      <w:pPr>
+        <w:pStyle w:val="Ttulo3"/>
+      </w:pPr>
+      <w:bookmarkStart w:id="44" w:name="_Toc213951453"/>
+      <w:r>
+        <w:lastRenderedPageBreak/>
+        <w:t xml:space="preserve">Comando </w:t>
+      </w:r>
+      <w:r>
+        <w:rPr>
+          <w:i/>
+          <w:iCs/>
+        </w:rPr>
+        <w:t>sudo certbot renew --dry-run</w:t>
+      </w:r>
+      <w:bookmarkEnd w:id="44"/>
+    </w:p>
+    <w:p>
+      <w:r>
+        <w:drawing>
+          <wp:inline distT="0" distB="0" distL="0" distR="0" wp14:anchorId="4838ACBD" wp14:editId="16F7400F">
+            <wp:extent cx="5400040" cy="2570480"/>
+            <wp:effectExtent l="0" t="0" r="0" b="1270"/>
+            <wp:docPr id="96885841" name="Imagen 1"/>
+            <wp:cNvGraphicFramePr>
+              <a:graphicFrameLocks xmlns:a="http://schemas.openxmlformats.org/drawingml/2006/main" noChangeAspect="1"/>
+            </wp:cNvGraphicFramePr>
+            <a:graphic xmlns:a="http://schemas.openxmlformats.org/drawingml/2006/main">
+              <a:graphicData uri="http://schemas.openxmlformats.org/drawingml/2006/picture">
+                <pic:pic xmlns:pic="http://schemas.openxmlformats.org/drawingml/2006/picture">
+                  <pic:nvPicPr>
+                    <pic:cNvPr id="96885841" name=""/>
+                    <pic:cNvPicPr/>
+                  </pic:nvPicPr>
+                  <pic:blipFill>
+                    <a:blip r:embed="rId40"/>
+                    <a:stretch>
+                      <a:fillRect/>
+                    </a:stretch>
+                  </pic:blipFill>
+                  <pic:spPr>
+                    <a:xfrm>
+                      <a:off x="0" y="0"/>
+                      <a:ext cx="5400040" cy="2570480"/>
+                    </a:xfrm>
+                    <a:prstGeom prst="rect">
+                      <a:avLst/>
+                    </a:prstGeom>
+                  </pic:spPr>
+                </pic:pic>
+              </a:graphicData>
+            </a:graphic>
+          </wp:inline>
+        </w:drawing>
+      </w:r>
+    </w:p>
     <w:sectPr>
       <w:pgSz w:w="11906" w:h="16838"/>
       <w:pgMar w:top="1417" w:right="1701" w:bottom="1417" w:left="1701" w:header="708" w:footer="708" w:gutter="0"/>
@@ -3448,8 +5816,123 @@
       </w:pPr>
     </w:lvl>
   </w:abstractNum>
+  <w:abstractNum w:abstractNumId="1" w15:restartNumberingAfterBreak="0">
+    <w:nsid w:val="669115DE"/>
+    <w:multiLevelType w:val="hybridMultilevel"/>
+    <w:tmpl w:val="0372787A"/>
+    <w:lvl w:ilvl="0" w:tplc="2A16D834">
+      <w:numFmt w:val="bullet"/>
+      <w:lvlText w:val=""/>
+      <w:lvlJc w:val="left"/>
+      <w:pPr>
+        <w:ind w:left="720" w:hanging="360"/>
+      </w:pPr>
+      <w:rPr>
+        <w:rFonts w:ascii="Symbol" w:eastAsiaTheme="minorHAnsi" w:hAnsi="Symbol" w:cstheme="minorBidi" w:hint="default"/>
+      </w:rPr>
+    </w:lvl>
+    <w:lvl w:ilvl="1" w:tplc="0C0A0003" w:tentative="1">
+      <w:start w:val="1"/>
+      <w:numFmt w:val="bullet"/>
+      <w:lvlText w:val="o"/>
+      <w:lvlJc w:val="left"/>
+      <w:pPr>
+        <w:ind w:left="1440" w:hanging="360"/>
+      </w:pPr>
+      <w:rPr>
+        <w:rFonts w:ascii="Courier New" w:hAnsi="Courier New" w:cs="Courier New" w:hint="default"/>
+      </w:rPr>
+    </w:lvl>
+    <w:lvl w:ilvl="2" w:tplc="0C0A0005" w:tentative="1">
+      <w:start w:val="1"/>
+      <w:numFmt w:val="bullet"/>
+      <w:lvlText w:val=""/>
+      <w:lvlJc w:val="left"/>
+      <w:pPr>
+        <w:ind w:left="2160" w:hanging="360"/>
+      </w:pPr>
+      <w:rPr>
+        <w:rFonts w:ascii="Wingdings" w:hAnsi="Wingdings" w:hint="default"/>
+      </w:rPr>
+    </w:lvl>
+    <w:lvl w:ilvl="3" w:tplc="0C0A0001" w:tentative="1">
+      <w:start w:val="1"/>
+      <w:numFmt w:val="bullet"/>
+      <w:lvlText w:val=""/>
+      <w:lvlJc w:val="left"/>
+      <w:pPr>
+        <w:ind w:left="2880" w:hanging="360"/>
+      </w:pPr>
+      <w:rPr>
+        <w:rFonts w:ascii="Symbol" w:hAnsi="Symbol" w:hint="default"/>
+      </w:rPr>
+    </w:lvl>
+    <w:lvl w:ilvl="4" w:tplc="0C0A0003" w:tentative="1">
+      <w:start w:val="1"/>
+      <w:numFmt w:val="bullet"/>
+      <w:lvlText w:val="o"/>
+      <w:lvlJc w:val="left"/>
+      <w:pPr>
+        <w:ind w:left="3600" w:hanging="360"/>
+      </w:pPr>
+      <w:rPr>
+        <w:rFonts w:ascii="Courier New" w:hAnsi="Courier New" w:cs="Courier New" w:hint="default"/>
+      </w:rPr>
+    </w:lvl>
+    <w:lvl w:ilvl="5" w:tplc="0C0A0005" w:tentative="1">
+      <w:start w:val="1"/>
+      <w:numFmt w:val="bullet"/>
+      <w:lvlText w:val=""/>
+      <w:lvlJc w:val="left"/>
+      <w:pPr>
+        <w:ind w:left="4320" w:hanging="360"/>
+      </w:pPr>
+      <w:rPr>
+        <w:rFonts w:ascii="Wingdings" w:hAnsi="Wingdings" w:hint="default"/>
+      </w:rPr>
+    </w:lvl>
+    <w:lvl w:ilvl="6" w:tplc="0C0A0001" w:tentative="1">
+      <w:start w:val="1"/>
+      <w:numFmt w:val="bullet"/>
+      <w:lvlText w:val=""/>
+      <w:lvlJc w:val="left"/>
+      <w:pPr>
+        <w:ind w:left="5040" w:hanging="360"/>
+      </w:pPr>
+      <w:rPr>
+        <w:rFonts w:ascii="Symbol" w:hAnsi="Symbol" w:hint="default"/>
+      </w:rPr>
+    </w:lvl>
+    <w:lvl w:ilvl="7" w:tplc="0C0A0003" w:tentative="1">
+      <w:start w:val="1"/>
+      <w:numFmt w:val="bullet"/>
+      <w:lvlText w:val="o"/>
+      <w:lvlJc w:val="left"/>
+      <w:pPr>
+        <w:ind w:left="5760" w:hanging="360"/>
+      </w:pPr>
+      <w:rPr>
+        <w:rFonts w:ascii="Courier New" w:hAnsi="Courier New" w:cs="Courier New" w:hint="default"/>
+      </w:rPr>
+    </w:lvl>
+    <w:lvl w:ilvl="8" w:tplc="0C0A0005" w:tentative="1">
+      <w:start w:val="1"/>
+      <w:numFmt w:val="bullet"/>
+      <w:lvlText w:val=""/>
+      <w:lvlJc w:val="left"/>
+      <w:pPr>
+        <w:ind w:left="6480" w:hanging="360"/>
+      </w:pPr>
+      <w:rPr>
+        <w:rFonts w:ascii="Wingdings" w:hAnsi="Wingdings" w:hint="default"/>
+      </w:rPr>
+    </w:lvl>
+  </w:abstractNum>
   <w:num w:numId="1" w16cid:durableId="920336243">
     <w:abstractNumId w:val="0"/>
+  </w:num>
+  <w:num w:numId="2" w16cid:durableId="512719179">
+    <w:abstractNumId w:val="1"/>
   </w:num>
 </w:numbering>
 </file>
@@ -4622,11 +7105,32 @@
     <w:pitch w:val="variable"/>
     <w:sig w:usb0="E0002EFF" w:usb1="C000785B" w:usb2="00000009" w:usb3="00000000" w:csb0="000001FF" w:csb1="00000000"/>
   </w:font>
+  <w:font w:name="Symbol">
+    <w:panose1 w:val="05050102010706020507"/>
+    <w:charset w:val="02"/>
+    <w:family w:val="roman"/>
+    <w:pitch w:val="variable"/>
+    <w:sig w:usb0="00000000" w:usb1="10000000" w:usb2="00000000" w:usb3="00000000" w:csb0="80000000" w:csb1="00000000"/>
+  </w:font>
   <w:font w:name="Aptos">
     <w:charset w:val="00"/>
     <w:family w:val="swiss"/>
     <w:pitch w:val="variable"/>
     <w:sig w:usb0="20000287" w:usb1="00000003" w:usb2="00000000" w:usb3="00000000" w:csb0="0000019F" w:csb1="00000000"/>
+  </w:font>
+  <w:font w:name="Courier New">
+    <w:panose1 w:val="02070309020205020404"/>
+    <w:charset w:val="00"/>
+    <w:family w:val="modern"/>
+    <w:pitch w:val="fixed"/>
+    <w:sig w:usb0="E0002EFF" w:usb1="C0007843" w:usb2="00000009" w:usb3="00000000" w:csb0="000001FF" w:csb1="00000000"/>
+  </w:font>
+  <w:font w:name="Wingdings">
+    <w:panose1 w:val="05000000000000000000"/>
+    <w:charset w:val="02"/>
+    <w:family w:val="auto"/>
+    <w:pitch w:val="variable"/>
+    <w:sig w:usb0="00000000" w:usb1="10000000" w:usb2="00000000" w:usb3="00000000" w:csb0="80000000" w:csb1="00000000"/>
   </w:font>
   <w:font w:name="Aptos Display">
     <w:charset w:val="00"/>
@@ -4657,9 +7161,15 @@
     <w:rsid w:val="002C659E"/>
     <w:rsid w:val="00357F4F"/>
     <w:rsid w:val="00422AF5"/>
+    <w:rsid w:val="004427B8"/>
     <w:rsid w:val="004749D3"/>
     <w:rsid w:val="006967B5"/>
     <w:rsid w:val="00733BEA"/>
+    <w:rsid w:val="0081333F"/>
+    <w:rsid w:val="008932E2"/>
+    <w:rsid w:val="008E3E1B"/>
+    <w:rsid w:val="009B3726"/>
+    <w:rsid w:val="009F79E7"/>
     <w:rsid w:val="00B86622"/>
     <w:rsid w:val="00EC41D1"/>
     <w:rsid w:val="00FC03DF"/>

</xml_diff>